<commit_message>
SD-24: persistir los mockups como archivos HTML reales (corrige gap de SD-23)
El usuario detecto que los 16 mockups + style-tile de SD-23 nunca se
escribieron al repositorio -- solo se habian renderizado en la
conversacion (visualizacion efimera, sin persistencia a disco).

- docs/08_diseno/mockups/: 19 archivos HTML autocontenidos
  (00_style_tile, p01..p16 con p10 en variante clara/oscura, index.html
  como galeria navegable por paquete). Colores hardcoded (mismos hex de
  DIS-01, sin variables CSS de ningun entorno externo), iconos Tabler
  via CDN, sin dependencias del proyecto.
- DIS-00: columna Archivo con enlace real por pantalla + nueva seccion 6.
- DIS-01: nueva seccion 8, puntero a la galeria.
- Gobernanza: SD-24, CHANGELOG v0.11.2; nota de cierre en SD-23.

Incluye ademas la edicion mas reciente del usuario en
Informe_Academico_Alan_Aura.docx (Word), sin cambios de mi parte en ese
archivo.
</commit_message>
<xml_diff>
--- a/docs/09_informe/Informe_Academico_Alan_Aura.docx
+++ b/docs/09_informe/Informe_Academico_Alan_Aura.docx
@@ -195,7 +195,15 @@
         <w:jc w:val="center"/>
       </w:pPr>
       <w:r>
-        <w:t>Grupo 5  ·  Período académico 2026-1</w:t>
+        <w:t xml:space="preserve">Grupo </w:t>
+      </w:r>
+      <w:proofErr w:type="gramStart"/>
+      <w:r>
+        <w:t>5  ·</w:t>
+      </w:r>
+      <w:proofErr w:type="gramEnd"/>
+      <w:r>
+        <w:t xml:space="preserve">  Período académico 2026-1</w:t>
       </w:r>
     </w:p>
     <w:p>
@@ -220,6 +228,7 @@
         <w:pStyle w:val="Ttulo1"/>
         <w:spacing w:before="320" w:after="140"/>
       </w:pPr>
+      <w:bookmarkStart w:id="0" w:name="_Toc235227417"/>
       <w:r>
         <w:rPr>
           <w:b/>
@@ -231,41 +240,2247 @@
         <w:lastRenderedPageBreak/>
         <w:t>Tabla de contenido</w:t>
       </w:r>
+      <w:bookmarkEnd w:id="0"/>
+    </w:p>
+    <w:p/>
+    <w:p>
+      <w:r>
+        <w:br w:type="page"/>
+      </w:r>
     </w:p>
     <w:sdt>
       <w:sdtPr>
-        <w:alias w:val="Tabla de contenido"/>
-        <w:id w:val="659580216"/>
+        <w:rPr>
+          <w:lang w:val="es-ES"/>
+        </w:rPr>
+        <w:id w:val="1500689902"/>
+        <w:docPartObj>
+          <w:docPartGallery w:val="Table of Contents"/>
+          <w:docPartUnique/>
+        </w:docPartObj>
       </w:sdtPr>
+      <w:sdtEndPr>
+        <w:rPr>
+          <w:rFonts w:ascii="Arial" w:eastAsia="Arial" w:hAnsi="Arial" w:cs="Arial"/>
+          <w:b/>
+          <w:bCs/>
+          <w:color w:val="1F1F1D"/>
+          <w:sz w:val="22"/>
+          <w:szCs w:val="22"/>
+        </w:rPr>
+      </w:sdtEndPr>
       <w:sdtContent>
         <w:p>
+          <w:pPr>
+            <w:pStyle w:val="TtuloTDC"/>
+          </w:pPr>
+          <w:r>
+            <w:rPr>
+              <w:lang w:val="es-ES"/>
+            </w:rPr>
+            <w:t>Tabla de contenido</w:t>
+          </w:r>
+        </w:p>
+        <w:p>
+          <w:pPr>
+            <w:pStyle w:val="TDC1"/>
+            <w:tabs>
+              <w:tab w:val="right" w:leader="dot" w:pos="9350"/>
+            </w:tabs>
+            <w:rPr>
+              <w:noProof/>
+            </w:rPr>
+          </w:pPr>
           <w:r>
             <w:fldChar w:fldCharType="begin"/>
           </w:r>
           <w:r>
-            <w:instrText>TOC \h \o "1-2"</w:instrText>
+            <w:instrText xml:space="preserve"> TOC \o "1-3" \h \z \u </w:instrText>
           </w:r>
           <w:r>
             <w:fldChar w:fldCharType="separate"/>
           </w:r>
+          <w:hyperlink w:anchor="_Toc235227417" w:history="1">
+            <w:r>
+              <w:rPr>
+                <w:rStyle w:val="Hipervnculo"/>
+                <w:b/>
+                <w:bCs/>
+                <w:noProof/>
+              </w:rPr>
+              <w:t>Tabla de contenido</w:t>
+            </w:r>
+            <w:r>
+              <w:rPr>
+                <w:noProof/>
+                <w:webHidden/>
+              </w:rPr>
+              <w:tab/>
+            </w:r>
+            <w:r>
+              <w:rPr>
+                <w:noProof/>
+                <w:webHidden/>
+              </w:rPr>
+              <w:fldChar w:fldCharType="begin"/>
+            </w:r>
+            <w:r>
+              <w:rPr>
+                <w:noProof/>
+                <w:webHidden/>
+              </w:rPr>
+              <w:instrText xml:space="preserve"> PAGEREF _Toc235227417 \h </w:instrText>
+            </w:r>
+            <w:r>
+              <w:rPr>
+                <w:noProof/>
+                <w:webHidden/>
+              </w:rPr>
+            </w:r>
+            <w:r>
+              <w:rPr>
+                <w:noProof/>
+                <w:webHidden/>
+              </w:rPr>
+              <w:fldChar w:fldCharType="separate"/>
+            </w:r>
+            <w:r>
+              <w:rPr>
+                <w:noProof/>
+                <w:webHidden/>
+              </w:rPr>
+              <w:t>2</w:t>
+            </w:r>
+            <w:r>
+              <w:rPr>
+                <w:noProof/>
+                <w:webHidden/>
+              </w:rPr>
+              <w:fldChar w:fldCharType="end"/>
+            </w:r>
+          </w:hyperlink>
+        </w:p>
+        <w:p>
+          <w:pPr>
+            <w:pStyle w:val="TDC1"/>
+            <w:tabs>
+              <w:tab w:val="right" w:leader="dot" w:pos="9350"/>
+            </w:tabs>
+            <w:rPr>
+              <w:noProof/>
+            </w:rPr>
+          </w:pPr>
+          <w:hyperlink w:anchor="_Toc235227418" w:history="1">
+            <w:r>
+              <w:rPr>
+                <w:rStyle w:val="Hipervnculo"/>
+                <w:b/>
+                <w:bCs/>
+                <w:noProof/>
+              </w:rPr>
+              <w:t>1. Resumen</w:t>
+            </w:r>
+            <w:r>
+              <w:rPr>
+                <w:noProof/>
+                <w:webHidden/>
+              </w:rPr>
+              <w:tab/>
+            </w:r>
+            <w:r>
+              <w:rPr>
+                <w:noProof/>
+                <w:webHidden/>
+              </w:rPr>
+              <w:fldChar w:fldCharType="begin"/>
+            </w:r>
+            <w:r>
+              <w:rPr>
+                <w:noProof/>
+                <w:webHidden/>
+              </w:rPr>
+              <w:instrText xml:space="preserve"> PAGEREF _Toc235227418 \h </w:instrText>
+            </w:r>
+            <w:r>
+              <w:rPr>
+                <w:noProof/>
+                <w:webHidden/>
+              </w:rPr>
+            </w:r>
+            <w:r>
+              <w:rPr>
+                <w:noProof/>
+                <w:webHidden/>
+              </w:rPr>
+              <w:fldChar w:fldCharType="separate"/>
+            </w:r>
+            <w:r>
+              <w:rPr>
+                <w:noProof/>
+                <w:webHidden/>
+              </w:rPr>
+              <w:t>3</w:t>
+            </w:r>
+            <w:r>
+              <w:rPr>
+                <w:noProof/>
+                <w:webHidden/>
+              </w:rPr>
+              <w:fldChar w:fldCharType="end"/>
+            </w:r>
+          </w:hyperlink>
+        </w:p>
+        <w:p>
+          <w:pPr>
+            <w:pStyle w:val="TDC1"/>
+            <w:tabs>
+              <w:tab w:val="right" w:leader="dot" w:pos="9350"/>
+            </w:tabs>
+            <w:rPr>
+              <w:noProof/>
+            </w:rPr>
+          </w:pPr>
+          <w:hyperlink w:anchor="_Toc235227419" w:history="1">
+            <w:r>
+              <w:rPr>
+                <w:rStyle w:val="Hipervnculo"/>
+                <w:b/>
+                <w:bCs/>
+                <w:noProof/>
+              </w:rPr>
+              <w:t>2. Introducción</w:t>
+            </w:r>
+            <w:r>
+              <w:rPr>
+                <w:noProof/>
+                <w:webHidden/>
+              </w:rPr>
+              <w:tab/>
+            </w:r>
+            <w:r>
+              <w:rPr>
+                <w:noProof/>
+                <w:webHidden/>
+              </w:rPr>
+              <w:fldChar w:fldCharType="begin"/>
+            </w:r>
+            <w:r>
+              <w:rPr>
+                <w:noProof/>
+                <w:webHidden/>
+              </w:rPr>
+              <w:instrText xml:space="preserve"> PAGEREF _Toc235227419 \h </w:instrText>
+            </w:r>
+            <w:r>
+              <w:rPr>
+                <w:noProof/>
+                <w:webHidden/>
+              </w:rPr>
+            </w:r>
+            <w:r>
+              <w:rPr>
+                <w:noProof/>
+                <w:webHidden/>
+              </w:rPr>
+              <w:fldChar w:fldCharType="separate"/>
+            </w:r>
+            <w:r>
+              <w:rPr>
+                <w:noProof/>
+                <w:webHidden/>
+              </w:rPr>
+              <w:t>3</w:t>
+            </w:r>
+            <w:r>
+              <w:rPr>
+                <w:noProof/>
+                <w:webHidden/>
+              </w:rPr>
+              <w:fldChar w:fldCharType="end"/>
+            </w:r>
+          </w:hyperlink>
+        </w:p>
+        <w:p>
+          <w:pPr>
+            <w:pStyle w:val="TDC2"/>
+            <w:tabs>
+              <w:tab w:val="right" w:leader="dot" w:pos="9350"/>
+            </w:tabs>
+            <w:rPr>
+              <w:noProof/>
+            </w:rPr>
+          </w:pPr>
+          <w:hyperlink w:anchor="_Toc235227420" w:history="1">
+            <w:r>
+              <w:rPr>
+                <w:rStyle w:val="Hipervnculo"/>
+                <w:b/>
+                <w:bCs/>
+                <w:noProof/>
+              </w:rPr>
+              <w:t>2.1. Contexto y motivación</w:t>
+            </w:r>
+            <w:r>
+              <w:rPr>
+                <w:noProof/>
+                <w:webHidden/>
+              </w:rPr>
+              <w:tab/>
+            </w:r>
+            <w:r>
+              <w:rPr>
+                <w:noProof/>
+                <w:webHidden/>
+              </w:rPr>
+              <w:fldChar w:fldCharType="begin"/>
+            </w:r>
+            <w:r>
+              <w:rPr>
+                <w:noProof/>
+                <w:webHidden/>
+              </w:rPr>
+              <w:instrText xml:space="preserve"> PAGEREF _Toc235227420 \h </w:instrText>
+            </w:r>
+            <w:r>
+              <w:rPr>
+                <w:noProof/>
+                <w:webHidden/>
+              </w:rPr>
+            </w:r>
+            <w:r>
+              <w:rPr>
+                <w:noProof/>
+                <w:webHidden/>
+              </w:rPr>
+              <w:fldChar w:fldCharType="separate"/>
+            </w:r>
+            <w:r>
+              <w:rPr>
+                <w:noProof/>
+                <w:webHidden/>
+              </w:rPr>
+              <w:t>3</w:t>
+            </w:r>
+            <w:r>
+              <w:rPr>
+                <w:noProof/>
+                <w:webHidden/>
+              </w:rPr>
+              <w:fldChar w:fldCharType="end"/>
+            </w:r>
+          </w:hyperlink>
+        </w:p>
+        <w:p>
+          <w:pPr>
+            <w:pStyle w:val="TDC2"/>
+            <w:tabs>
+              <w:tab w:val="right" w:leader="dot" w:pos="9350"/>
+            </w:tabs>
+            <w:rPr>
+              <w:noProof/>
+            </w:rPr>
+          </w:pPr>
+          <w:hyperlink w:anchor="_Toc235227421" w:history="1">
+            <w:r>
+              <w:rPr>
+                <w:rStyle w:val="Hipervnculo"/>
+                <w:b/>
+                <w:bCs/>
+                <w:noProof/>
+              </w:rPr>
+              <w:t>2.2. Problema</w:t>
+            </w:r>
+            <w:r>
+              <w:rPr>
+                <w:noProof/>
+                <w:webHidden/>
+              </w:rPr>
+              <w:tab/>
+            </w:r>
+            <w:r>
+              <w:rPr>
+                <w:noProof/>
+                <w:webHidden/>
+              </w:rPr>
+              <w:fldChar w:fldCharType="begin"/>
+            </w:r>
+            <w:r>
+              <w:rPr>
+                <w:noProof/>
+                <w:webHidden/>
+              </w:rPr>
+              <w:instrText xml:space="preserve"> PAGEREF _Toc235227421 \h </w:instrText>
+            </w:r>
+            <w:r>
+              <w:rPr>
+                <w:noProof/>
+                <w:webHidden/>
+              </w:rPr>
+            </w:r>
+            <w:r>
+              <w:rPr>
+                <w:noProof/>
+                <w:webHidden/>
+              </w:rPr>
+              <w:fldChar w:fldCharType="separate"/>
+            </w:r>
+            <w:r>
+              <w:rPr>
+                <w:noProof/>
+                <w:webHidden/>
+              </w:rPr>
+              <w:t>3</w:t>
+            </w:r>
+            <w:r>
+              <w:rPr>
+                <w:noProof/>
+                <w:webHidden/>
+              </w:rPr>
+              <w:fldChar w:fldCharType="end"/>
+            </w:r>
+          </w:hyperlink>
+        </w:p>
+        <w:p>
+          <w:pPr>
+            <w:pStyle w:val="TDC2"/>
+            <w:tabs>
+              <w:tab w:val="right" w:leader="dot" w:pos="9350"/>
+            </w:tabs>
+            <w:rPr>
+              <w:noProof/>
+            </w:rPr>
+          </w:pPr>
+          <w:hyperlink w:anchor="_Toc235227422" w:history="1">
+            <w:r>
+              <w:rPr>
+                <w:rStyle w:val="Hipervnculo"/>
+                <w:b/>
+                <w:bCs/>
+                <w:noProof/>
+              </w:rPr>
+              <w:t>2.3. Objetivo del informe</w:t>
+            </w:r>
+            <w:r>
+              <w:rPr>
+                <w:noProof/>
+                <w:webHidden/>
+              </w:rPr>
+              <w:tab/>
+            </w:r>
+            <w:r>
+              <w:rPr>
+                <w:noProof/>
+                <w:webHidden/>
+              </w:rPr>
+              <w:fldChar w:fldCharType="begin"/>
+            </w:r>
+            <w:r>
+              <w:rPr>
+                <w:noProof/>
+                <w:webHidden/>
+              </w:rPr>
+              <w:instrText xml:space="preserve"> PAGEREF _Toc235227422 \h </w:instrText>
+            </w:r>
+            <w:r>
+              <w:rPr>
+                <w:noProof/>
+                <w:webHidden/>
+              </w:rPr>
+            </w:r>
+            <w:r>
+              <w:rPr>
+                <w:noProof/>
+                <w:webHidden/>
+              </w:rPr>
+              <w:fldChar w:fldCharType="separate"/>
+            </w:r>
+            <w:r>
+              <w:rPr>
+                <w:noProof/>
+                <w:webHidden/>
+              </w:rPr>
+              <w:t>4</w:t>
+            </w:r>
+            <w:r>
+              <w:rPr>
+                <w:noProof/>
+                <w:webHidden/>
+              </w:rPr>
+              <w:fldChar w:fldCharType="end"/>
+            </w:r>
+          </w:hyperlink>
+        </w:p>
+        <w:p>
+          <w:pPr>
+            <w:pStyle w:val="TDC1"/>
+            <w:tabs>
+              <w:tab w:val="right" w:leader="dot" w:pos="9350"/>
+            </w:tabs>
+            <w:rPr>
+              <w:noProof/>
+            </w:rPr>
+          </w:pPr>
+          <w:hyperlink w:anchor="_Toc235227423" w:history="1">
+            <w:r>
+              <w:rPr>
+                <w:rStyle w:val="Hipervnculo"/>
+                <w:b/>
+                <w:bCs/>
+                <w:noProof/>
+              </w:rPr>
+              <w:t>3. Objetivos del proyecto</w:t>
+            </w:r>
+            <w:r>
+              <w:rPr>
+                <w:noProof/>
+                <w:webHidden/>
+              </w:rPr>
+              <w:tab/>
+            </w:r>
+            <w:r>
+              <w:rPr>
+                <w:noProof/>
+                <w:webHidden/>
+              </w:rPr>
+              <w:fldChar w:fldCharType="begin"/>
+            </w:r>
+            <w:r>
+              <w:rPr>
+                <w:noProof/>
+                <w:webHidden/>
+              </w:rPr>
+              <w:instrText xml:space="preserve"> PAGEREF _Toc235227423 \h </w:instrText>
+            </w:r>
+            <w:r>
+              <w:rPr>
+                <w:noProof/>
+                <w:webHidden/>
+              </w:rPr>
+            </w:r>
+            <w:r>
+              <w:rPr>
+                <w:noProof/>
+                <w:webHidden/>
+              </w:rPr>
+              <w:fldChar w:fldCharType="separate"/>
+            </w:r>
+            <w:r>
+              <w:rPr>
+                <w:noProof/>
+                <w:webHidden/>
+              </w:rPr>
+              <w:t>4</w:t>
+            </w:r>
+            <w:r>
+              <w:rPr>
+                <w:noProof/>
+                <w:webHidden/>
+              </w:rPr>
+              <w:fldChar w:fldCharType="end"/>
+            </w:r>
+          </w:hyperlink>
+        </w:p>
+        <w:p>
+          <w:pPr>
+            <w:pStyle w:val="TDC2"/>
+            <w:tabs>
+              <w:tab w:val="right" w:leader="dot" w:pos="9350"/>
+            </w:tabs>
+            <w:rPr>
+              <w:noProof/>
+            </w:rPr>
+          </w:pPr>
+          <w:hyperlink w:anchor="_Toc235227424" w:history="1">
+            <w:r>
+              <w:rPr>
+                <w:rStyle w:val="Hipervnculo"/>
+                <w:b/>
+                <w:bCs/>
+                <w:noProof/>
+              </w:rPr>
+              <w:t>3.1. Objetivo general</w:t>
+            </w:r>
+            <w:r>
+              <w:rPr>
+                <w:noProof/>
+                <w:webHidden/>
+              </w:rPr>
+              <w:tab/>
+            </w:r>
+            <w:r>
+              <w:rPr>
+                <w:noProof/>
+                <w:webHidden/>
+              </w:rPr>
+              <w:fldChar w:fldCharType="begin"/>
+            </w:r>
+            <w:r>
+              <w:rPr>
+                <w:noProof/>
+                <w:webHidden/>
+              </w:rPr>
+              <w:instrText xml:space="preserve"> PAGEREF _Toc235227424 \h </w:instrText>
+            </w:r>
+            <w:r>
+              <w:rPr>
+                <w:noProof/>
+                <w:webHidden/>
+              </w:rPr>
+            </w:r>
+            <w:r>
+              <w:rPr>
+                <w:noProof/>
+                <w:webHidden/>
+              </w:rPr>
+              <w:fldChar w:fldCharType="separate"/>
+            </w:r>
+            <w:r>
+              <w:rPr>
+                <w:noProof/>
+                <w:webHidden/>
+              </w:rPr>
+              <w:t>4</w:t>
+            </w:r>
+            <w:r>
+              <w:rPr>
+                <w:noProof/>
+                <w:webHidden/>
+              </w:rPr>
+              <w:fldChar w:fldCharType="end"/>
+            </w:r>
+          </w:hyperlink>
+        </w:p>
+        <w:p>
+          <w:pPr>
+            <w:pStyle w:val="TDC2"/>
+            <w:tabs>
+              <w:tab w:val="right" w:leader="dot" w:pos="9350"/>
+            </w:tabs>
+            <w:rPr>
+              <w:noProof/>
+            </w:rPr>
+          </w:pPr>
+          <w:hyperlink w:anchor="_Toc235227425" w:history="1">
+            <w:r>
+              <w:rPr>
+                <w:rStyle w:val="Hipervnculo"/>
+                <w:b/>
+                <w:bCs/>
+                <w:noProof/>
+              </w:rPr>
+              <w:t>3.2. Objetivos específicos</w:t>
+            </w:r>
+            <w:r>
+              <w:rPr>
+                <w:noProof/>
+                <w:webHidden/>
+              </w:rPr>
+              <w:tab/>
+            </w:r>
+            <w:r>
+              <w:rPr>
+                <w:noProof/>
+                <w:webHidden/>
+              </w:rPr>
+              <w:fldChar w:fldCharType="begin"/>
+            </w:r>
+            <w:r>
+              <w:rPr>
+                <w:noProof/>
+                <w:webHidden/>
+              </w:rPr>
+              <w:instrText xml:space="preserve"> PAGEREF _Toc235227425 \h </w:instrText>
+            </w:r>
+            <w:r>
+              <w:rPr>
+                <w:noProof/>
+                <w:webHidden/>
+              </w:rPr>
+            </w:r>
+            <w:r>
+              <w:rPr>
+                <w:noProof/>
+                <w:webHidden/>
+              </w:rPr>
+              <w:fldChar w:fldCharType="separate"/>
+            </w:r>
+            <w:r>
+              <w:rPr>
+                <w:noProof/>
+                <w:webHidden/>
+              </w:rPr>
+              <w:t>4</w:t>
+            </w:r>
+            <w:r>
+              <w:rPr>
+                <w:noProof/>
+                <w:webHidden/>
+              </w:rPr>
+              <w:fldChar w:fldCharType="end"/>
+            </w:r>
+          </w:hyperlink>
+        </w:p>
+        <w:p>
+          <w:pPr>
+            <w:pStyle w:val="TDC1"/>
+            <w:tabs>
+              <w:tab w:val="right" w:leader="dot" w:pos="9350"/>
+            </w:tabs>
+            <w:rPr>
+              <w:noProof/>
+            </w:rPr>
+          </w:pPr>
+          <w:hyperlink w:anchor="_Toc235227426" w:history="1">
+            <w:r>
+              <w:rPr>
+                <w:rStyle w:val="Hipervnculo"/>
+                <w:b/>
+                <w:bCs/>
+                <w:noProof/>
+              </w:rPr>
+              <w:t>4. Marco metodológico</w:t>
+            </w:r>
+            <w:r>
+              <w:rPr>
+                <w:noProof/>
+                <w:webHidden/>
+              </w:rPr>
+              <w:tab/>
+            </w:r>
+            <w:r>
+              <w:rPr>
+                <w:noProof/>
+                <w:webHidden/>
+              </w:rPr>
+              <w:fldChar w:fldCharType="begin"/>
+            </w:r>
+            <w:r>
+              <w:rPr>
+                <w:noProof/>
+                <w:webHidden/>
+              </w:rPr>
+              <w:instrText xml:space="preserve"> PAGEREF _Toc235227426 \h </w:instrText>
+            </w:r>
+            <w:r>
+              <w:rPr>
+                <w:noProof/>
+                <w:webHidden/>
+              </w:rPr>
+            </w:r>
+            <w:r>
+              <w:rPr>
+                <w:noProof/>
+                <w:webHidden/>
+              </w:rPr>
+              <w:fldChar w:fldCharType="separate"/>
+            </w:r>
+            <w:r>
+              <w:rPr>
+                <w:noProof/>
+                <w:webHidden/>
+              </w:rPr>
+              <w:t>4</w:t>
+            </w:r>
+            <w:r>
+              <w:rPr>
+                <w:noProof/>
+                <w:webHidden/>
+              </w:rPr>
+              <w:fldChar w:fldCharType="end"/>
+            </w:r>
+          </w:hyperlink>
+        </w:p>
+        <w:p>
+          <w:pPr>
+            <w:pStyle w:val="TDC1"/>
+            <w:tabs>
+              <w:tab w:val="right" w:leader="dot" w:pos="9350"/>
+            </w:tabs>
+            <w:rPr>
+              <w:noProof/>
+            </w:rPr>
+          </w:pPr>
+          <w:hyperlink w:anchor="_Toc235227427" w:history="1">
+            <w:r>
+              <w:rPr>
+                <w:rStyle w:val="Hipervnculo"/>
+                <w:b/>
+                <w:bCs/>
+                <w:noProof/>
+              </w:rPr>
+              <w:t>5. Alcance del MVP y canon ético</w:t>
+            </w:r>
+            <w:r>
+              <w:rPr>
+                <w:noProof/>
+                <w:webHidden/>
+              </w:rPr>
+              <w:tab/>
+            </w:r>
+            <w:r>
+              <w:rPr>
+                <w:noProof/>
+                <w:webHidden/>
+              </w:rPr>
+              <w:fldChar w:fldCharType="begin"/>
+            </w:r>
+            <w:r>
+              <w:rPr>
+                <w:noProof/>
+                <w:webHidden/>
+              </w:rPr>
+              <w:instrText xml:space="preserve"> PAGEREF _Toc235227427 \h </w:instrText>
+            </w:r>
+            <w:r>
+              <w:rPr>
+                <w:noProof/>
+                <w:webHidden/>
+              </w:rPr>
+            </w:r>
+            <w:r>
+              <w:rPr>
+                <w:noProof/>
+                <w:webHidden/>
+              </w:rPr>
+              <w:fldChar w:fldCharType="separate"/>
+            </w:r>
+            <w:r>
+              <w:rPr>
+                <w:noProof/>
+                <w:webHidden/>
+              </w:rPr>
+              <w:t>5</w:t>
+            </w:r>
+            <w:r>
+              <w:rPr>
+                <w:noProof/>
+                <w:webHidden/>
+              </w:rPr>
+              <w:fldChar w:fldCharType="end"/>
+            </w:r>
+          </w:hyperlink>
+        </w:p>
+        <w:p>
+          <w:pPr>
+            <w:pStyle w:val="TDC2"/>
+            <w:tabs>
+              <w:tab w:val="right" w:leader="dot" w:pos="9350"/>
+            </w:tabs>
+            <w:rPr>
+              <w:noProof/>
+            </w:rPr>
+          </w:pPr>
+          <w:hyperlink w:anchor="_Toc235227428" w:history="1">
+            <w:r>
+              <w:rPr>
+                <w:rStyle w:val="Hipervnculo"/>
+                <w:b/>
+                <w:bCs/>
+                <w:noProof/>
+              </w:rPr>
+              <w:t>5.1. Qué sí entra en el MVP</w:t>
+            </w:r>
+            <w:r>
+              <w:rPr>
+                <w:noProof/>
+                <w:webHidden/>
+              </w:rPr>
+              <w:tab/>
+            </w:r>
+            <w:r>
+              <w:rPr>
+                <w:noProof/>
+                <w:webHidden/>
+              </w:rPr>
+              <w:fldChar w:fldCharType="begin"/>
+            </w:r>
+            <w:r>
+              <w:rPr>
+                <w:noProof/>
+                <w:webHidden/>
+              </w:rPr>
+              <w:instrText xml:space="preserve"> PAGEREF _Toc235227428 \h </w:instrText>
+            </w:r>
+            <w:r>
+              <w:rPr>
+                <w:noProof/>
+                <w:webHidden/>
+              </w:rPr>
+            </w:r>
+            <w:r>
+              <w:rPr>
+                <w:noProof/>
+                <w:webHidden/>
+              </w:rPr>
+              <w:fldChar w:fldCharType="separate"/>
+            </w:r>
+            <w:r>
+              <w:rPr>
+                <w:noProof/>
+                <w:webHidden/>
+              </w:rPr>
+              <w:t>5</w:t>
+            </w:r>
+            <w:r>
+              <w:rPr>
+                <w:noProof/>
+                <w:webHidden/>
+              </w:rPr>
+              <w:fldChar w:fldCharType="end"/>
+            </w:r>
+          </w:hyperlink>
+        </w:p>
+        <w:p>
+          <w:pPr>
+            <w:pStyle w:val="TDC2"/>
+            <w:tabs>
+              <w:tab w:val="right" w:leader="dot" w:pos="9350"/>
+            </w:tabs>
+            <w:rPr>
+              <w:noProof/>
+            </w:rPr>
+          </w:pPr>
+          <w:hyperlink w:anchor="_Toc235227429" w:history="1">
+            <w:r>
+              <w:rPr>
+                <w:rStyle w:val="Hipervnculo"/>
+                <w:b/>
+                <w:bCs/>
+                <w:noProof/>
+              </w:rPr>
+              <w:t>5.2. Qué queda fuera de alcance</w:t>
+            </w:r>
+            <w:r>
+              <w:rPr>
+                <w:noProof/>
+                <w:webHidden/>
+              </w:rPr>
+              <w:tab/>
+            </w:r>
+            <w:r>
+              <w:rPr>
+                <w:noProof/>
+                <w:webHidden/>
+              </w:rPr>
+              <w:fldChar w:fldCharType="begin"/>
+            </w:r>
+            <w:r>
+              <w:rPr>
+                <w:noProof/>
+                <w:webHidden/>
+              </w:rPr>
+              <w:instrText xml:space="preserve"> PAGEREF _Toc235227429 \h </w:instrText>
+            </w:r>
+            <w:r>
+              <w:rPr>
+                <w:noProof/>
+                <w:webHidden/>
+              </w:rPr>
+            </w:r>
+            <w:r>
+              <w:rPr>
+                <w:noProof/>
+                <w:webHidden/>
+              </w:rPr>
+              <w:fldChar w:fldCharType="separate"/>
+            </w:r>
+            <w:r>
+              <w:rPr>
+                <w:noProof/>
+                <w:webHidden/>
+              </w:rPr>
+              <w:t>5</w:t>
+            </w:r>
+            <w:r>
+              <w:rPr>
+                <w:noProof/>
+                <w:webHidden/>
+              </w:rPr>
+              <w:fldChar w:fldCharType="end"/>
+            </w:r>
+          </w:hyperlink>
+        </w:p>
+        <w:p>
+          <w:pPr>
+            <w:pStyle w:val="TDC2"/>
+            <w:tabs>
+              <w:tab w:val="right" w:leader="dot" w:pos="9350"/>
+            </w:tabs>
+            <w:rPr>
+              <w:noProof/>
+            </w:rPr>
+          </w:pPr>
+          <w:hyperlink w:anchor="_Toc235227430" w:history="1">
+            <w:r>
+              <w:rPr>
+                <w:rStyle w:val="Hipervnculo"/>
+                <w:b/>
+                <w:bCs/>
+                <w:noProof/>
+              </w:rPr>
+              <w:t>5.3. Canon ético de dominio</w:t>
+            </w:r>
+            <w:r>
+              <w:rPr>
+                <w:noProof/>
+                <w:webHidden/>
+              </w:rPr>
+              <w:tab/>
+            </w:r>
+            <w:r>
+              <w:rPr>
+                <w:noProof/>
+                <w:webHidden/>
+              </w:rPr>
+              <w:fldChar w:fldCharType="begin"/>
+            </w:r>
+            <w:r>
+              <w:rPr>
+                <w:noProof/>
+                <w:webHidden/>
+              </w:rPr>
+              <w:instrText xml:space="preserve"> PAGEREF _Toc235227430 \h </w:instrText>
+            </w:r>
+            <w:r>
+              <w:rPr>
+                <w:noProof/>
+                <w:webHidden/>
+              </w:rPr>
+            </w:r>
+            <w:r>
+              <w:rPr>
+                <w:noProof/>
+                <w:webHidden/>
+              </w:rPr>
+              <w:fldChar w:fldCharType="separate"/>
+            </w:r>
+            <w:r>
+              <w:rPr>
+                <w:noProof/>
+                <w:webHidden/>
+              </w:rPr>
+              <w:t>6</w:t>
+            </w:r>
+            <w:r>
+              <w:rPr>
+                <w:noProof/>
+                <w:webHidden/>
+              </w:rPr>
+              <w:fldChar w:fldCharType="end"/>
+            </w:r>
+          </w:hyperlink>
+        </w:p>
+        <w:p>
+          <w:pPr>
+            <w:pStyle w:val="TDC1"/>
+            <w:tabs>
+              <w:tab w:val="right" w:leader="dot" w:pos="9350"/>
+            </w:tabs>
+            <w:rPr>
+              <w:noProof/>
+            </w:rPr>
+          </w:pPr>
+          <w:hyperlink w:anchor="_Toc235227431" w:history="1">
+            <w:r>
+              <w:rPr>
+                <w:rStyle w:val="Hipervnculo"/>
+                <w:b/>
+                <w:bCs/>
+                <w:noProof/>
+              </w:rPr>
+              <w:t>6. Desarrollo del proyecto</w:t>
+            </w:r>
+            <w:r>
+              <w:rPr>
+                <w:noProof/>
+                <w:webHidden/>
+              </w:rPr>
+              <w:tab/>
+            </w:r>
+            <w:r>
+              <w:rPr>
+                <w:noProof/>
+                <w:webHidden/>
+              </w:rPr>
+              <w:fldChar w:fldCharType="begin"/>
+            </w:r>
+            <w:r>
+              <w:rPr>
+                <w:noProof/>
+                <w:webHidden/>
+              </w:rPr>
+              <w:instrText xml:space="preserve"> PAGEREF _Toc235227431 \h </w:instrText>
+            </w:r>
+            <w:r>
+              <w:rPr>
+                <w:noProof/>
+                <w:webHidden/>
+              </w:rPr>
+            </w:r>
+            <w:r>
+              <w:rPr>
+                <w:noProof/>
+                <w:webHidden/>
+              </w:rPr>
+              <w:fldChar w:fldCharType="separate"/>
+            </w:r>
+            <w:r>
+              <w:rPr>
+                <w:noProof/>
+                <w:webHidden/>
+              </w:rPr>
+              <w:t>6</w:t>
+            </w:r>
+            <w:r>
+              <w:rPr>
+                <w:noProof/>
+                <w:webHidden/>
+              </w:rPr>
+              <w:fldChar w:fldCharType="end"/>
+            </w:r>
+          </w:hyperlink>
+        </w:p>
+        <w:p>
+          <w:pPr>
+            <w:pStyle w:val="TDC2"/>
+            <w:tabs>
+              <w:tab w:val="right" w:leader="dot" w:pos="9350"/>
+            </w:tabs>
+            <w:rPr>
+              <w:noProof/>
+            </w:rPr>
+          </w:pPr>
+          <w:hyperlink w:anchor="_Toc235227432" w:history="1">
+            <w:r>
+              <w:rPr>
+                <w:rStyle w:val="Hipervnculo"/>
+                <w:b/>
+                <w:bCs/>
+                <w:noProof/>
+              </w:rPr>
+              <w:t>6.1. Fase 1 — Paquete documental</w:t>
+            </w:r>
+            <w:r>
+              <w:rPr>
+                <w:noProof/>
+                <w:webHidden/>
+              </w:rPr>
+              <w:tab/>
+            </w:r>
+            <w:r>
+              <w:rPr>
+                <w:noProof/>
+                <w:webHidden/>
+              </w:rPr>
+              <w:fldChar w:fldCharType="begin"/>
+            </w:r>
+            <w:r>
+              <w:rPr>
+                <w:noProof/>
+                <w:webHidden/>
+              </w:rPr>
+              <w:instrText xml:space="preserve"> PAGEREF _Toc235227432 \h </w:instrText>
+            </w:r>
+            <w:r>
+              <w:rPr>
+                <w:noProof/>
+                <w:webHidden/>
+              </w:rPr>
+            </w:r>
+            <w:r>
+              <w:rPr>
+                <w:noProof/>
+                <w:webHidden/>
+              </w:rPr>
+              <w:fldChar w:fldCharType="separate"/>
+            </w:r>
+            <w:r>
+              <w:rPr>
+                <w:noProof/>
+                <w:webHidden/>
+              </w:rPr>
+              <w:t>6</w:t>
+            </w:r>
+            <w:r>
+              <w:rPr>
+                <w:noProof/>
+                <w:webHidden/>
+              </w:rPr>
+              <w:fldChar w:fldCharType="end"/>
+            </w:r>
+          </w:hyperlink>
+        </w:p>
+        <w:p>
+          <w:pPr>
+            <w:pStyle w:val="TDC2"/>
+            <w:tabs>
+              <w:tab w:val="right" w:leader="dot" w:pos="9350"/>
+            </w:tabs>
+            <w:rPr>
+              <w:noProof/>
+            </w:rPr>
+          </w:pPr>
+          <w:hyperlink w:anchor="_Toc235227433" w:history="1">
+            <w:r>
+              <w:rPr>
+                <w:rStyle w:val="Hipervnculo"/>
+                <w:b/>
+                <w:bCs/>
+                <w:noProof/>
+              </w:rPr>
+              <w:t>6.2. Fase 2 — Análisis y diseño ICONIX</w:t>
+            </w:r>
+            <w:r>
+              <w:rPr>
+                <w:noProof/>
+                <w:webHidden/>
+              </w:rPr>
+              <w:tab/>
+            </w:r>
+            <w:r>
+              <w:rPr>
+                <w:noProof/>
+                <w:webHidden/>
+              </w:rPr>
+              <w:fldChar w:fldCharType="begin"/>
+            </w:r>
+            <w:r>
+              <w:rPr>
+                <w:noProof/>
+                <w:webHidden/>
+              </w:rPr>
+              <w:instrText xml:space="preserve"> PAGEREF _Toc235227433 \h </w:instrText>
+            </w:r>
+            <w:r>
+              <w:rPr>
+                <w:noProof/>
+                <w:webHidden/>
+              </w:rPr>
+            </w:r>
+            <w:r>
+              <w:rPr>
+                <w:noProof/>
+                <w:webHidden/>
+              </w:rPr>
+              <w:fldChar w:fldCharType="separate"/>
+            </w:r>
+            <w:r>
+              <w:rPr>
+                <w:noProof/>
+                <w:webHidden/>
+              </w:rPr>
+              <w:t>7</w:t>
+            </w:r>
+            <w:r>
+              <w:rPr>
+                <w:noProof/>
+                <w:webHidden/>
+              </w:rPr>
+              <w:fldChar w:fldCharType="end"/>
+            </w:r>
+          </w:hyperlink>
+        </w:p>
+        <w:p>
+          <w:pPr>
+            <w:pStyle w:val="TDC2"/>
+            <w:tabs>
+              <w:tab w:val="right" w:leader="dot" w:pos="9350"/>
+            </w:tabs>
+            <w:rPr>
+              <w:noProof/>
+            </w:rPr>
+          </w:pPr>
+          <w:hyperlink w:anchor="_Toc235227434" w:history="1">
+            <w:r>
+              <w:rPr>
+                <w:rStyle w:val="Hipervnculo"/>
+                <w:b/>
+                <w:bCs/>
+                <w:noProof/>
+              </w:rPr>
+              <w:t>6.2.1. Modelo de dominio (MD-01)</w:t>
+            </w:r>
+            <w:r>
+              <w:rPr>
+                <w:noProof/>
+                <w:webHidden/>
+              </w:rPr>
+              <w:tab/>
+            </w:r>
+            <w:r>
+              <w:rPr>
+                <w:noProof/>
+                <w:webHidden/>
+              </w:rPr>
+              <w:fldChar w:fldCharType="begin"/>
+            </w:r>
+            <w:r>
+              <w:rPr>
+                <w:noProof/>
+                <w:webHidden/>
+              </w:rPr>
+              <w:instrText xml:space="preserve"> PAGEREF _Toc235227434 \h </w:instrText>
+            </w:r>
+            <w:r>
+              <w:rPr>
+                <w:noProof/>
+                <w:webHidden/>
+              </w:rPr>
+            </w:r>
+            <w:r>
+              <w:rPr>
+                <w:noProof/>
+                <w:webHidden/>
+              </w:rPr>
+              <w:fldChar w:fldCharType="separate"/>
+            </w:r>
+            <w:r>
+              <w:rPr>
+                <w:noProof/>
+                <w:webHidden/>
+              </w:rPr>
+              <w:t>7</w:t>
+            </w:r>
+            <w:r>
+              <w:rPr>
+                <w:noProof/>
+                <w:webHidden/>
+              </w:rPr>
+              <w:fldChar w:fldCharType="end"/>
+            </w:r>
+          </w:hyperlink>
+        </w:p>
+        <w:p>
+          <w:pPr>
+            <w:pStyle w:val="TDC2"/>
+            <w:tabs>
+              <w:tab w:val="right" w:leader="dot" w:pos="9350"/>
+            </w:tabs>
+            <w:rPr>
+              <w:noProof/>
+            </w:rPr>
+          </w:pPr>
+          <w:hyperlink w:anchor="_Toc235227435" w:history="1">
+            <w:r>
+              <w:rPr>
+                <w:rStyle w:val="Hipervnculo"/>
+                <w:b/>
+                <w:bCs/>
+                <w:noProof/>
+              </w:rPr>
+              <w:t>6.2.2. Diagrama de casos de uso (DCU-01)</w:t>
+            </w:r>
+            <w:r>
+              <w:rPr>
+                <w:noProof/>
+                <w:webHidden/>
+              </w:rPr>
+              <w:tab/>
+            </w:r>
+            <w:r>
+              <w:rPr>
+                <w:noProof/>
+                <w:webHidden/>
+              </w:rPr>
+              <w:fldChar w:fldCharType="begin"/>
+            </w:r>
+            <w:r>
+              <w:rPr>
+                <w:noProof/>
+                <w:webHidden/>
+              </w:rPr>
+              <w:instrText xml:space="preserve"> PAGEREF _Toc235227435 \h </w:instrText>
+            </w:r>
+            <w:r>
+              <w:rPr>
+                <w:noProof/>
+                <w:webHidden/>
+              </w:rPr>
+            </w:r>
+            <w:r>
+              <w:rPr>
+                <w:noProof/>
+                <w:webHidden/>
+              </w:rPr>
+              <w:fldChar w:fldCharType="separate"/>
+            </w:r>
+            <w:r>
+              <w:rPr>
+                <w:noProof/>
+                <w:webHidden/>
+              </w:rPr>
+              <w:t>7</w:t>
+            </w:r>
+            <w:r>
+              <w:rPr>
+                <w:noProof/>
+                <w:webHidden/>
+              </w:rPr>
+              <w:fldChar w:fldCharType="end"/>
+            </w:r>
+          </w:hyperlink>
+        </w:p>
+        <w:p>
+          <w:pPr>
+            <w:pStyle w:val="TDC2"/>
+            <w:tabs>
+              <w:tab w:val="right" w:leader="dot" w:pos="9350"/>
+            </w:tabs>
+            <w:rPr>
+              <w:noProof/>
+            </w:rPr>
+          </w:pPr>
+          <w:hyperlink w:anchor="_Toc235227436" w:history="1">
+            <w:r>
+              <w:rPr>
+                <w:rStyle w:val="Hipervnculo"/>
+                <w:b/>
+                <w:bCs/>
+                <w:noProof/>
+              </w:rPr>
+              <w:t>6.2.3. Especificación de los casos de uso (ECU-00…ECU-10)</w:t>
+            </w:r>
+            <w:r>
+              <w:rPr>
+                <w:noProof/>
+                <w:webHidden/>
+              </w:rPr>
+              <w:tab/>
+            </w:r>
+            <w:r>
+              <w:rPr>
+                <w:noProof/>
+                <w:webHidden/>
+              </w:rPr>
+              <w:fldChar w:fldCharType="begin"/>
+            </w:r>
+            <w:r>
+              <w:rPr>
+                <w:noProof/>
+                <w:webHidden/>
+              </w:rPr>
+              <w:instrText xml:space="preserve"> PAGEREF _Toc235227436 \h </w:instrText>
+            </w:r>
+            <w:r>
+              <w:rPr>
+                <w:noProof/>
+                <w:webHidden/>
+              </w:rPr>
+            </w:r>
+            <w:r>
+              <w:rPr>
+                <w:noProof/>
+                <w:webHidden/>
+              </w:rPr>
+              <w:fldChar w:fldCharType="separate"/>
+            </w:r>
+            <w:r>
+              <w:rPr>
+                <w:noProof/>
+                <w:webHidden/>
+              </w:rPr>
+              <w:t>7</w:t>
+            </w:r>
+            <w:r>
+              <w:rPr>
+                <w:noProof/>
+                <w:webHidden/>
+              </w:rPr>
+              <w:fldChar w:fldCharType="end"/>
+            </w:r>
+          </w:hyperlink>
+        </w:p>
+        <w:p>
+          <w:pPr>
+            <w:pStyle w:val="TDC2"/>
+            <w:tabs>
+              <w:tab w:val="right" w:leader="dot" w:pos="9350"/>
+            </w:tabs>
+            <w:rPr>
+              <w:noProof/>
+            </w:rPr>
+          </w:pPr>
+          <w:hyperlink w:anchor="_Toc235227437" w:history="1">
+            <w:r>
+              <w:rPr>
+                <w:rStyle w:val="Hipervnculo"/>
+                <w:b/>
+                <w:bCs/>
+                <w:noProof/>
+              </w:rPr>
+              <w:t>6.3. Reconciliaciones con la fuente primaria</w:t>
+            </w:r>
+            <w:r>
+              <w:rPr>
+                <w:noProof/>
+                <w:webHidden/>
+              </w:rPr>
+              <w:tab/>
+            </w:r>
+            <w:r>
+              <w:rPr>
+                <w:noProof/>
+                <w:webHidden/>
+              </w:rPr>
+              <w:fldChar w:fldCharType="begin"/>
+            </w:r>
+            <w:r>
+              <w:rPr>
+                <w:noProof/>
+                <w:webHidden/>
+              </w:rPr>
+              <w:instrText xml:space="preserve"> PAGEREF _Toc235227437 \h </w:instrText>
+            </w:r>
+            <w:r>
+              <w:rPr>
+                <w:noProof/>
+                <w:webHidden/>
+              </w:rPr>
+            </w:r>
+            <w:r>
+              <w:rPr>
+                <w:noProof/>
+                <w:webHidden/>
+              </w:rPr>
+              <w:fldChar w:fldCharType="separate"/>
+            </w:r>
+            <w:r>
+              <w:rPr>
+                <w:noProof/>
+                <w:webHidden/>
+              </w:rPr>
+              <w:t>7</w:t>
+            </w:r>
+            <w:r>
+              <w:rPr>
+                <w:noProof/>
+                <w:webHidden/>
+              </w:rPr>
+              <w:fldChar w:fldCharType="end"/>
+            </w:r>
+          </w:hyperlink>
+        </w:p>
+        <w:p>
+          <w:pPr>
+            <w:pStyle w:val="TDC2"/>
+            <w:tabs>
+              <w:tab w:val="right" w:leader="dot" w:pos="9350"/>
+            </w:tabs>
+            <w:rPr>
+              <w:noProof/>
+            </w:rPr>
+          </w:pPr>
+          <w:hyperlink w:anchor="_Toc235227438" w:history="1">
+            <w:r>
+              <w:rPr>
+                <w:rStyle w:val="Hipervnculo"/>
+                <w:b/>
+                <w:bCs/>
+                <w:noProof/>
+              </w:rPr>
+              <w:t>6.4. Diseño de interfaz — sistema y mockups</w:t>
+            </w:r>
+            <w:r>
+              <w:rPr>
+                <w:noProof/>
+                <w:webHidden/>
+              </w:rPr>
+              <w:tab/>
+            </w:r>
+            <w:r>
+              <w:rPr>
+                <w:noProof/>
+                <w:webHidden/>
+              </w:rPr>
+              <w:fldChar w:fldCharType="begin"/>
+            </w:r>
+            <w:r>
+              <w:rPr>
+                <w:noProof/>
+                <w:webHidden/>
+              </w:rPr>
+              <w:instrText xml:space="preserve"> PAGEREF _Toc235227438 \h </w:instrText>
+            </w:r>
+            <w:r>
+              <w:rPr>
+                <w:noProof/>
+                <w:webHidden/>
+              </w:rPr>
+            </w:r>
+            <w:r>
+              <w:rPr>
+                <w:noProof/>
+                <w:webHidden/>
+              </w:rPr>
+              <w:fldChar w:fldCharType="separate"/>
+            </w:r>
+            <w:r>
+              <w:rPr>
+                <w:noProof/>
+                <w:webHidden/>
+              </w:rPr>
+              <w:t>8</w:t>
+            </w:r>
+            <w:r>
+              <w:rPr>
+                <w:noProof/>
+                <w:webHidden/>
+              </w:rPr>
+              <w:fldChar w:fldCharType="end"/>
+            </w:r>
+          </w:hyperlink>
+        </w:p>
+        <w:p>
+          <w:pPr>
+            <w:pStyle w:val="TDC1"/>
+            <w:tabs>
+              <w:tab w:val="right" w:leader="dot" w:pos="9350"/>
+            </w:tabs>
+            <w:rPr>
+              <w:noProof/>
+            </w:rPr>
+          </w:pPr>
+          <w:hyperlink w:anchor="_Toc235227439" w:history="1">
+            <w:r>
+              <w:rPr>
+                <w:rStyle w:val="Hipervnculo"/>
+                <w:b/>
+                <w:bCs/>
+                <w:noProof/>
+              </w:rPr>
+              <w:t>7. Arquitectura y decisiones técnicas</w:t>
+            </w:r>
+            <w:r>
+              <w:rPr>
+                <w:noProof/>
+                <w:webHidden/>
+              </w:rPr>
+              <w:tab/>
+            </w:r>
+            <w:r>
+              <w:rPr>
+                <w:noProof/>
+                <w:webHidden/>
+              </w:rPr>
+              <w:fldChar w:fldCharType="begin"/>
+            </w:r>
+            <w:r>
+              <w:rPr>
+                <w:noProof/>
+                <w:webHidden/>
+              </w:rPr>
+              <w:instrText xml:space="preserve"> PAGEREF _Toc235227439 \h </w:instrText>
+            </w:r>
+            <w:r>
+              <w:rPr>
+                <w:noProof/>
+                <w:webHidden/>
+              </w:rPr>
+            </w:r>
+            <w:r>
+              <w:rPr>
+                <w:noProof/>
+                <w:webHidden/>
+              </w:rPr>
+              <w:fldChar w:fldCharType="separate"/>
+            </w:r>
+            <w:r>
+              <w:rPr>
+                <w:noProof/>
+                <w:webHidden/>
+              </w:rPr>
+              <w:t>9</w:t>
+            </w:r>
+            <w:r>
+              <w:rPr>
+                <w:noProof/>
+                <w:webHidden/>
+              </w:rPr>
+              <w:fldChar w:fldCharType="end"/>
+            </w:r>
+          </w:hyperlink>
+        </w:p>
+        <w:p>
+          <w:pPr>
+            <w:pStyle w:val="TDC1"/>
+            <w:tabs>
+              <w:tab w:val="right" w:leader="dot" w:pos="9350"/>
+            </w:tabs>
+            <w:rPr>
+              <w:noProof/>
+            </w:rPr>
+          </w:pPr>
+          <w:hyperlink w:anchor="_Toc235227440" w:history="1">
+            <w:r>
+              <w:rPr>
+                <w:rStyle w:val="Hipervnculo"/>
+                <w:b/>
+                <w:bCs/>
+                <w:noProof/>
+              </w:rPr>
+              <w:t>8. Trazabilidad y verificación</w:t>
+            </w:r>
+            <w:r>
+              <w:rPr>
+                <w:noProof/>
+                <w:webHidden/>
+              </w:rPr>
+              <w:tab/>
+            </w:r>
+            <w:r>
+              <w:rPr>
+                <w:noProof/>
+                <w:webHidden/>
+              </w:rPr>
+              <w:fldChar w:fldCharType="begin"/>
+            </w:r>
+            <w:r>
+              <w:rPr>
+                <w:noProof/>
+                <w:webHidden/>
+              </w:rPr>
+              <w:instrText xml:space="preserve"> PAGEREF _Toc235227440 \h </w:instrText>
+            </w:r>
+            <w:r>
+              <w:rPr>
+                <w:noProof/>
+                <w:webHidden/>
+              </w:rPr>
+            </w:r>
+            <w:r>
+              <w:rPr>
+                <w:noProof/>
+                <w:webHidden/>
+              </w:rPr>
+              <w:fldChar w:fldCharType="separate"/>
+            </w:r>
+            <w:r>
+              <w:rPr>
+                <w:noProof/>
+                <w:webHidden/>
+              </w:rPr>
+              <w:t>9</w:t>
+            </w:r>
+            <w:r>
+              <w:rPr>
+                <w:noProof/>
+                <w:webHidden/>
+              </w:rPr>
+              <w:fldChar w:fldCharType="end"/>
+            </w:r>
+          </w:hyperlink>
+        </w:p>
+        <w:p>
+          <w:pPr>
+            <w:pStyle w:val="TDC1"/>
+            <w:tabs>
+              <w:tab w:val="right" w:leader="dot" w:pos="9350"/>
+            </w:tabs>
+            <w:rPr>
+              <w:noProof/>
+            </w:rPr>
+          </w:pPr>
+          <w:hyperlink w:anchor="_Toc235227441" w:history="1">
+            <w:r>
+              <w:rPr>
+                <w:rStyle w:val="Hipervnculo"/>
+                <w:b/>
+                <w:bCs/>
+                <w:noProof/>
+              </w:rPr>
+              <w:t>9. Requisitos de calidad (ISO/IEC 25010:2023 + GQM)</w:t>
+            </w:r>
+            <w:r>
+              <w:rPr>
+                <w:noProof/>
+                <w:webHidden/>
+              </w:rPr>
+              <w:tab/>
+            </w:r>
+            <w:r>
+              <w:rPr>
+                <w:noProof/>
+                <w:webHidden/>
+              </w:rPr>
+              <w:fldChar w:fldCharType="begin"/>
+            </w:r>
+            <w:r>
+              <w:rPr>
+                <w:noProof/>
+                <w:webHidden/>
+              </w:rPr>
+              <w:instrText xml:space="preserve"> PAGEREF _Toc235227441 \h </w:instrText>
+            </w:r>
+            <w:r>
+              <w:rPr>
+                <w:noProof/>
+                <w:webHidden/>
+              </w:rPr>
+            </w:r>
+            <w:r>
+              <w:rPr>
+                <w:noProof/>
+                <w:webHidden/>
+              </w:rPr>
+              <w:fldChar w:fldCharType="separate"/>
+            </w:r>
+            <w:r>
+              <w:rPr>
+                <w:noProof/>
+                <w:webHidden/>
+              </w:rPr>
+              <w:t>9</w:t>
+            </w:r>
+            <w:r>
+              <w:rPr>
+                <w:noProof/>
+                <w:webHidden/>
+              </w:rPr>
+              <w:fldChar w:fldCharType="end"/>
+            </w:r>
+          </w:hyperlink>
+        </w:p>
+        <w:p>
+          <w:pPr>
+            <w:pStyle w:val="TDC1"/>
+            <w:tabs>
+              <w:tab w:val="right" w:leader="dot" w:pos="9350"/>
+            </w:tabs>
+            <w:rPr>
+              <w:noProof/>
+            </w:rPr>
+          </w:pPr>
+          <w:hyperlink w:anchor="_Toc235227442" w:history="1">
+            <w:r>
+              <w:rPr>
+                <w:rStyle w:val="Hipervnculo"/>
+                <w:b/>
+                <w:bCs/>
+                <w:noProof/>
+              </w:rPr>
+              <w:t>10. Resultados y estado actual</w:t>
+            </w:r>
+            <w:r>
+              <w:rPr>
+                <w:noProof/>
+                <w:webHidden/>
+              </w:rPr>
+              <w:tab/>
+            </w:r>
+            <w:r>
+              <w:rPr>
+                <w:noProof/>
+                <w:webHidden/>
+              </w:rPr>
+              <w:fldChar w:fldCharType="begin"/>
+            </w:r>
+            <w:r>
+              <w:rPr>
+                <w:noProof/>
+                <w:webHidden/>
+              </w:rPr>
+              <w:instrText xml:space="preserve"> PAGEREF _Toc235227442 \h </w:instrText>
+            </w:r>
+            <w:r>
+              <w:rPr>
+                <w:noProof/>
+                <w:webHidden/>
+              </w:rPr>
+            </w:r>
+            <w:r>
+              <w:rPr>
+                <w:noProof/>
+                <w:webHidden/>
+              </w:rPr>
+              <w:fldChar w:fldCharType="separate"/>
+            </w:r>
+            <w:r>
+              <w:rPr>
+                <w:noProof/>
+                <w:webHidden/>
+              </w:rPr>
+              <w:t>10</w:t>
+            </w:r>
+            <w:r>
+              <w:rPr>
+                <w:noProof/>
+                <w:webHidden/>
+              </w:rPr>
+              <w:fldChar w:fldCharType="end"/>
+            </w:r>
+          </w:hyperlink>
+        </w:p>
+        <w:p>
+          <w:pPr>
+            <w:pStyle w:val="TDC1"/>
+            <w:tabs>
+              <w:tab w:val="right" w:leader="dot" w:pos="9350"/>
+            </w:tabs>
+            <w:rPr>
+              <w:noProof/>
+            </w:rPr>
+          </w:pPr>
+          <w:hyperlink w:anchor="_Toc235227443" w:history="1">
+            <w:r>
+              <w:rPr>
+                <w:rStyle w:val="Hipervnculo"/>
+                <w:b/>
+                <w:bCs/>
+                <w:noProof/>
+              </w:rPr>
+              <w:t>11. Conclusiones y trabajo futuro</w:t>
+            </w:r>
+            <w:r>
+              <w:rPr>
+                <w:noProof/>
+                <w:webHidden/>
+              </w:rPr>
+              <w:tab/>
+            </w:r>
+            <w:r>
+              <w:rPr>
+                <w:noProof/>
+                <w:webHidden/>
+              </w:rPr>
+              <w:fldChar w:fldCharType="begin"/>
+            </w:r>
+            <w:r>
+              <w:rPr>
+                <w:noProof/>
+                <w:webHidden/>
+              </w:rPr>
+              <w:instrText xml:space="preserve"> PAGEREF _Toc235227443 \h </w:instrText>
+            </w:r>
+            <w:r>
+              <w:rPr>
+                <w:noProof/>
+                <w:webHidden/>
+              </w:rPr>
+            </w:r>
+            <w:r>
+              <w:rPr>
+                <w:noProof/>
+                <w:webHidden/>
+              </w:rPr>
+              <w:fldChar w:fldCharType="separate"/>
+            </w:r>
+            <w:r>
+              <w:rPr>
+                <w:noProof/>
+                <w:webHidden/>
+              </w:rPr>
+              <w:t>10</w:t>
+            </w:r>
+            <w:r>
+              <w:rPr>
+                <w:noProof/>
+                <w:webHidden/>
+              </w:rPr>
+              <w:fldChar w:fldCharType="end"/>
+            </w:r>
+          </w:hyperlink>
+        </w:p>
+        <w:p>
+          <w:pPr>
+            <w:pStyle w:val="TDC1"/>
+            <w:tabs>
+              <w:tab w:val="right" w:leader="dot" w:pos="9350"/>
+            </w:tabs>
+            <w:rPr>
+              <w:noProof/>
+            </w:rPr>
+          </w:pPr>
+          <w:hyperlink w:anchor="_Toc235227444" w:history="1">
+            <w:r>
+              <w:rPr>
+                <w:rStyle w:val="Hipervnculo"/>
+                <w:b/>
+                <w:bCs/>
+                <w:noProof/>
+              </w:rPr>
+              <w:t>12. Referencias</w:t>
+            </w:r>
+            <w:r>
+              <w:rPr>
+                <w:noProof/>
+                <w:webHidden/>
+              </w:rPr>
+              <w:tab/>
+            </w:r>
+            <w:r>
+              <w:rPr>
+                <w:noProof/>
+                <w:webHidden/>
+              </w:rPr>
+              <w:fldChar w:fldCharType="begin"/>
+            </w:r>
+            <w:r>
+              <w:rPr>
+                <w:noProof/>
+                <w:webHidden/>
+              </w:rPr>
+              <w:instrText xml:space="preserve"> PAGEREF _Toc235227444 \h </w:instrText>
+            </w:r>
+            <w:r>
+              <w:rPr>
+                <w:noProof/>
+                <w:webHidden/>
+              </w:rPr>
+            </w:r>
+            <w:r>
+              <w:rPr>
+                <w:noProof/>
+                <w:webHidden/>
+              </w:rPr>
+              <w:fldChar w:fldCharType="separate"/>
+            </w:r>
+            <w:r>
+              <w:rPr>
+                <w:noProof/>
+                <w:webHidden/>
+              </w:rPr>
+              <w:t>11</w:t>
+            </w:r>
+            <w:r>
+              <w:rPr>
+                <w:noProof/>
+                <w:webHidden/>
+              </w:rPr>
+              <w:fldChar w:fldCharType="end"/>
+            </w:r>
+          </w:hyperlink>
+        </w:p>
+        <w:p>
+          <w:pPr>
+            <w:pStyle w:val="TDC1"/>
+            <w:tabs>
+              <w:tab w:val="right" w:leader="dot" w:pos="9350"/>
+            </w:tabs>
+            <w:rPr>
+              <w:noProof/>
+            </w:rPr>
+          </w:pPr>
+          <w:hyperlink w:anchor="_Toc235227445" w:history="1">
+            <w:r>
+              <w:rPr>
+                <w:rStyle w:val="Hipervnculo"/>
+                <w:b/>
+                <w:bCs/>
+                <w:noProof/>
+              </w:rPr>
+              <w:t>13. Anexos</w:t>
+            </w:r>
+            <w:r>
+              <w:rPr>
+                <w:noProof/>
+                <w:webHidden/>
+              </w:rPr>
+              <w:tab/>
+            </w:r>
+            <w:r>
+              <w:rPr>
+                <w:noProof/>
+                <w:webHidden/>
+              </w:rPr>
+              <w:fldChar w:fldCharType="begin"/>
+            </w:r>
+            <w:r>
+              <w:rPr>
+                <w:noProof/>
+                <w:webHidden/>
+              </w:rPr>
+              <w:instrText xml:space="preserve"> PAGEREF _Toc235227445 \h </w:instrText>
+            </w:r>
+            <w:r>
+              <w:rPr>
+                <w:noProof/>
+                <w:webHidden/>
+              </w:rPr>
+            </w:r>
+            <w:r>
+              <w:rPr>
+                <w:noProof/>
+                <w:webHidden/>
+              </w:rPr>
+              <w:fldChar w:fldCharType="separate"/>
+            </w:r>
+            <w:r>
+              <w:rPr>
+                <w:noProof/>
+                <w:webHidden/>
+              </w:rPr>
+              <w:t>11</w:t>
+            </w:r>
+            <w:r>
+              <w:rPr>
+                <w:noProof/>
+                <w:webHidden/>
+              </w:rPr>
+              <w:fldChar w:fldCharType="end"/>
+            </w:r>
+          </w:hyperlink>
+        </w:p>
+        <w:p>
+          <w:pPr>
+            <w:pStyle w:val="TDC2"/>
+            <w:tabs>
+              <w:tab w:val="right" w:leader="dot" w:pos="9350"/>
+            </w:tabs>
+            <w:rPr>
+              <w:noProof/>
+            </w:rPr>
+          </w:pPr>
+          <w:hyperlink w:anchor="_Toc235227446" w:history="1">
+            <w:r>
+              <w:rPr>
+                <w:rStyle w:val="Hipervnculo"/>
+                <w:b/>
+                <w:bCs/>
+                <w:noProof/>
+              </w:rPr>
+              <w:t>Anexo A. Índice de artefactos del proyecto</w:t>
+            </w:r>
+            <w:r>
+              <w:rPr>
+                <w:noProof/>
+                <w:webHidden/>
+              </w:rPr>
+              <w:tab/>
+            </w:r>
+            <w:r>
+              <w:rPr>
+                <w:noProof/>
+                <w:webHidden/>
+              </w:rPr>
+              <w:fldChar w:fldCharType="begin"/>
+            </w:r>
+            <w:r>
+              <w:rPr>
+                <w:noProof/>
+                <w:webHidden/>
+              </w:rPr>
+              <w:instrText xml:space="preserve"> PAGEREF _Toc235227446 \h </w:instrText>
+            </w:r>
+            <w:r>
+              <w:rPr>
+                <w:noProof/>
+                <w:webHidden/>
+              </w:rPr>
+            </w:r>
+            <w:r>
+              <w:rPr>
+                <w:noProof/>
+                <w:webHidden/>
+              </w:rPr>
+              <w:fldChar w:fldCharType="separate"/>
+            </w:r>
+            <w:r>
+              <w:rPr>
+                <w:noProof/>
+                <w:webHidden/>
+              </w:rPr>
+              <w:t>11</w:t>
+            </w:r>
+            <w:r>
+              <w:rPr>
+                <w:noProof/>
+                <w:webHidden/>
+              </w:rPr>
+              <w:fldChar w:fldCharType="end"/>
+            </w:r>
+          </w:hyperlink>
+        </w:p>
+        <w:p>
+          <w:pPr>
+            <w:pStyle w:val="TDC2"/>
+            <w:tabs>
+              <w:tab w:val="right" w:leader="dot" w:pos="9350"/>
+            </w:tabs>
+            <w:rPr>
+              <w:noProof/>
+            </w:rPr>
+          </w:pPr>
+          <w:hyperlink w:anchor="_Toc235227447" w:history="1">
+            <w:r>
+              <w:rPr>
+                <w:rStyle w:val="Hipervnculo"/>
+                <w:b/>
+                <w:bCs/>
+                <w:noProof/>
+              </w:rPr>
+              <w:t>Anexo B. Inventario de pantallas del MVP</w:t>
+            </w:r>
+            <w:r>
+              <w:rPr>
+                <w:noProof/>
+                <w:webHidden/>
+              </w:rPr>
+              <w:tab/>
+            </w:r>
+            <w:r>
+              <w:rPr>
+                <w:noProof/>
+                <w:webHidden/>
+              </w:rPr>
+              <w:fldChar w:fldCharType="begin"/>
+            </w:r>
+            <w:r>
+              <w:rPr>
+                <w:noProof/>
+                <w:webHidden/>
+              </w:rPr>
+              <w:instrText xml:space="preserve"> PAGEREF _Toc235227447 \h </w:instrText>
+            </w:r>
+            <w:r>
+              <w:rPr>
+                <w:noProof/>
+                <w:webHidden/>
+              </w:rPr>
+            </w:r>
+            <w:r>
+              <w:rPr>
+                <w:noProof/>
+                <w:webHidden/>
+              </w:rPr>
+              <w:fldChar w:fldCharType="separate"/>
+            </w:r>
+            <w:r>
+              <w:rPr>
+                <w:noProof/>
+                <w:webHidden/>
+              </w:rPr>
+              <w:t>12</w:t>
+            </w:r>
+            <w:r>
+              <w:rPr>
+                <w:noProof/>
+                <w:webHidden/>
+              </w:rPr>
+              <w:fldChar w:fldCharType="end"/>
+            </w:r>
+          </w:hyperlink>
         </w:p>
         <w:p>
           <w:r>
+            <w:rPr>
+              <w:b/>
+              <w:bCs/>
+              <w:lang w:val="es-ES"/>
+            </w:rPr>
             <w:fldChar w:fldCharType="end"/>
           </w:r>
         </w:p>
       </w:sdtContent>
     </w:sdt>
-    <w:p>
-      <w:r>
-        <w:br w:type="page"/>
-      </w:r>
-    </w:p>
+    <w:p/>
+    <w:p/>
+    <w:p/>
     <w:p>
       <w:pPr>
         <w:pStyle w:val="Ttulo1"/>
         <w:spacing w:before="320" w:after="140"/>
       </w:pPr>
+      <w:bookmarkStart w:id="1" w:name="_Toc235227418"/>
       <w:r>
         <w:rPr>
           <w:b/>
@@ -277,6 +2492,7 @@
         <w:lastRenderedPageBreak/>
         <w:t>1. Resumen</w:t>
       </w:r>
+      <w:bookmarkEnd w:id="1"/>
     </w:p>
     <w:p>
       <w:pPr>
@@ -318,6 +2534,7 @@
         <w:pStyle w:val="Ttulo1"/>
         <w:spacing w:before="320" w:after="140"/>
       </w:pPr>
+      <w:bookmarkStart w:id="2" w:name="_Toc235227419"/>
       <w:r>
         <w:rPr>
           <w:b/>
@@ -328,12 +2545,14 @@
         </w:rPr>
         <w:t>2. Introducción</w:t>
       </w:r>
+      <w:bookmarkEnd w:id="2"/>
     </w:p>
     <w:p>
       <w:pPr>
         <w:pStyle w:val="Ttulo2"/>
         <w:spacing w:before="220" w:after="100"/>
       </w:pPr>
+      <w:bookmarkStart w:id="3" w:name="_Toc235227420"/>
       <w:r>
         <w:rPr>
           <w:b/>
@@ -344,6 +2563,7 @@
         </w:rPr>
         <w:t>2.1. Contexto y motivación</w:t>
       </w:r>
+      <w:bookmarkEnd w:id="3"/>
     </w:p>
     <w:p>
       <w:pPr>
@@ -384,6 +2604,7 @@
         <w:pStyle w:val="Ttulo2"/>
         <w:spacing w:before="220" w:after="100"/>
       </w:pPr>
+      <w:bookmarkStart w:id="4" w:name="_Toc235227421"/>
       <w:r>
         <w:rPr>
           <w:b/>
@@ -394,6 +2615,7 @@
         </w:rPr>
         <w:t>2.2. Problema</w:t>
       </w:r>
+      <w:bookmarkEnd w:id="4"/>
     </w:p>
     <w:p>
       <w:pPr>
@@ -410,6 +2632,7 @@
         <w:pStyle w:val="Ttulo2"/>
         <w:spacing w:before="220" w:after="100"/>
       </w:pPr>
+      <w:bookmarkStart w:id="5" w:name="_Toc235227422"/>
       <w:r>
         <w:rPr>
           <w:b/>
@@ -420,6 +2643,7 @@
         </w:rPr>
         <w:t>2.3. Objetivo del informe</w:t>
       </w:r>
+      <w:bookmarkEnd w:id="5"/>
     </w:p>
     <w:p>
       <w:pPr>
@@ -435,6 +2659,7 @@
         <w:pStyle w:val="Ttulo1"/>
         <w:spacing w:before="320" w:after="140"/>
       </w:pPr>
+      <w:bookmarkStart w:id="6" w:name="_Toc235227423"/>
       <w:r>
         <w:rPr>
           <w:b/>
@@ -445,12 +2670,14 @@
         </w:rPr>
         <w:t>3. Objetivos del proyecto</w:t>
       </w:r>
+      <w:bookmarkEnd w:id="6"/>
     </w:p>
     <w:p>
       <w:pPr>
         <w:pStyle w:val="Ttulo2"/>
         <w:spacing w:before="220" w:after="100"/>
       </w:pPr>
+      <w:bookmarkStart w:id="7" w:name="_Toc235227424"/>
       <w:r>
         <w:rPr>
           <w:b/>
@@ -461,6 +2688,7 @@
         </w:rPr>
         <w:t>3.1. Objetivo general</w:t>
       </w:r>
+      <w:bookmarkEnd w:id="7"/>
     </w:p>
     <w:p>
       <w:pPr>
@@ -484,6 +2712,7 @@
         <w:pStyle w:val="Ttulo2"/>
         <w:spacing w:before="220" w:after="100"/>
       </w:pPr>
+      <w:bookmarkStart w:id="8" w:name="_Toc235227425"/>
       <w:r>
         <w:rPr>
           <w:b/>
@@ -494,6 +2723,7 @@
         </w:rPr>
         <w:t>3.2. Objetivos específicos</w:t>
       </w:r>
+      <w:bookmarkEnd w:id="8"/>
     </w:p>
     <w:tbl>
       <w:tblPr>
@@ -517,12 +2747,6 @@
         <w:gridCol w:w="8260"/>
       </w:tblGrid>
       <w:tr>
-        <w:tblPrEx>
-          <w:tblCellMar>
-            <w:top w:w="0" w:type="dxa"/>
-            <w:bottom w:w="0" w:type="dxa"/>
-          </w:tblCellMar>
-        </w:tblPrEx>
         <w:trPr>
           <w:tblHeader/>
         </w:trPr>
@@ -576,12 +2800,6 @@
         </w:tc>
       </w:tr>
       <w:tr>
-        <w:tblPrEx>
-          <w:tblCellMar>
-            <w:top w:w="0" w:type="dxa"/>
-            <w:bottom w:w="0" w:type="dxa"/>
-          </w:tblCellMar>
-        </w:tblPrEx>
         <w:tc>
           <w:tcPr>
             <w:tcW w:w="1100" w:type="dxa"/>
@@ -633,12 +2851,6 @@
         </w:tc>
       </w:tr>
       <w:tr>
-        <w:tblPrEx>
-          <w:tblCellMar>
-            <w:top w:w="0" w:type="dxa"/>
-            <w:bottom w:w="0" w:type="dxa"/>
-          </w:tblCellMar>
-        </w:tblPrEx>
         <w:tc>
           <w:tcPr>
             <w:tcW w:w="1100" w:type="dxa"/>
@@ -677,18 +2889,28 @@
                 <w:sz w:val="19"/>
                 <w:szCs w:val="19"/>
               </w:rPr>
-              <w:t>Conversación con un modelo de lenguaje gobernado, donde la personalidad de Alan/Aura modula el tono pero no compromete la seguridad.</w:t>
+              <w:t xml:space="preserve">Conversación con un modelo de lenguaje gobernado, donde la personalidad de Alan/Aura modula el </w:t>
+            </w:r>
+            <w:proofErr w:type="gramStart"/>
+            <w:r>
+              <w:rPr>
+                <w:sz w:val="19"/>
+                <w:szCs w:val="19"/>
+              </w:rPr>
+              <w:t>tono</w:t>
+            </w:r>
+            <w:proofErr w:type="gramEnd"/>
+            <w:r>
+              <w:rPr>
+                <w:sz w:val="19"/>
+                <w:szCs w:val="19"/>
+              </w:rPr>
+              <w:t xml:space="preserve"> pero no compromete la seguridad.</w:t>
             </w:r>
           </w:p>
         </w:tc>
       </w:tr>
       <w:tr>
-        <w:tblPrEx>
-          <w:tblCellMar>
-            <w:top w:w="0" w:type="dxa"/>
-            <w:bottom w:w="0" w:type="dxa"/>
-          </w:tblCellMar>
-        </w:tblPrEx>
         <w:tc>
           <w:tcPr>
             <w:tcW w:w="1100" w:type="dxa"/>
@@ -747,12 +2969,6 @@
         </w:tc>
       </w:tr>
       <w:tr>
-        <w:tblPrEx>
-          <w:tblCellMar>
-            <w:top w:w="0" w:type="dxa"/>
-            <w:bottom w:w="0" w:type="dxa"/>
-          </w:tblCellMar>
-        </w:tblPrEx>
         <w:tc>
           <w:tcPr>
             <w:tcW w:w="1100" w:type="dxa"/>
@@ -797,12 +3013,6 @@
         </w:tc>
       </w:tr>
       <w:tr>
-        <w:tblPrEx>
-          <w:tblCellMar>
-            <w:top w:w="0" w:type="dxa"/>
-            <w:bottom w:w="0" w:type="dxa"/>
-          </w:tblCellMar>
-        </w:tblPrEx>
         <w:tc>
           <w:tcPr>
             <w:tcW w:w="1100" w:type="dxa"/>
@@ -845,12 +3055,6 @@
         </w:tc>
       </w:tr>
       <w:tr>
-        <w:tblPrEx>
-          <w:tblCellMar>
-            <w:top w:w="0" w:type="dxa"/>
-            <w:bottom w:w="0" w:type="dxa"/>
-          </w:tblCellMar>
-        </w:tblPrEx>
         <w:tc>
           <w:tcPr>
             <w:tcW w:w="1100" w:type="dxa"/>
@@ -911,12 +3115,6 @@
         </w:tc>
       </w:tr>
       <w:tr>
-        <w:tblPrEx>
-          <w:tblCellMar>
-            <w:top w:w="0" w:type="dxa"/>
-            <w:bottom w:w="0" w:type="dxa"/>
-          </w:tblCellMar>
-        </w:tblPrEx>
         <w:tc>
           <w:tcPr>
             <w:tcW w:w="1100" w:type="dxa"/>
@@ -964,6 +3162,7 @@
         <w:pStyle w:val="Ttulo1"/>
         <w:spacing w:before="320" w:after="140"/>
       </w:pPr>
+      <w:bookmarkStart w:id="9" w:name="_Toc235227426"/>
       <w:r>
         <w:rPr>
           <w:b/>
@@ -974,6 +3173,7 @@
         </w:rPr>
         <w:t>4. Marco metodológico</w:t>
       </w:r>
+      <w:bookmarkEnd w:id="9"/>
     </w:p>
     <w:p>
       <w:pPr>
@@ -1125,12 +3325,6 @@
         <w:gridCol w:w="1700"/>
       </w:tblGrid>
       <w:tr>
-        <w:tblPrEx>
-          <w:tblCellMar>
-            <w:top w:w="0" w:type="dxa"/>
-            <w:bottom w:w="0" w:type="dxa"/>
-          </w:tblCellMar>
-        </w:tblPrEx>
         <w:trPr>
           <w:tblHeader/>
         </w:trPr>
@@ -1208,12 +3402,6 @@
         </w:tc>
       </w:tr>
       <w:tr>
-        <w:tblPrEx>
-          <w:tblCellMar>
-            <w:top w:w="0" w:type="dxa"/>
-            <w:bottom w:w="0" w:type="dxa"/>
-          </w:tblCellMar>
-        </w:tblPrEx>
         <w:tc>
           <w:tcPr>
             <w:tcW w:w="1700" w:type="dxa"/>
@@ -1276,12 +3464,6 @@
         </w:tc>
       </w:tr>
       <w:tr>
-        <w:tblPrEx>
-          <w:tblCellMar>
-            <w:top w:w="0" w:type="dxa"/>
-            <w:bottom w:w="0" w:type="dxa"/>
-          </w:tblCellMar>
-        </w:tblPrEx>
         <w:tc>
           <w:tcPr>
             <w:tcW w:w="1700" w:type="dxa"/>
@@ -1347,12 +3529,6 @@
         </w:tc>
       </w:tr>
       <w:tr>
-        <w:tblPrEx>
-          <w:tblCellMar>
-            <w:top w:w="0" w:type="dxa"/>
-            <w:bottom w:w="0" w:type="dxa"/>
-          </w:tblCellMar>
-        </w:tblPrEx>
         <w:tc>
           <w:tcPr>
             <w:tcW w:w="1700" w:type="dxa"/>
@@ -1415,12 +3591,6 @@
         </w:tc>
       </w:tr>
       <w:tr>
-        <w:tblPrEx>
-          <w:tblCellMar>
-            <w:top w:w="0" w:type="dxa"/>
-            <w:bottom w:w="0" w:type="dxa"/>
-          </w:tblCellMar>
-        </w:tblPrEx>
         <w:tc>
           <w:tcPr>
             <w:tcW w:w="1700" w:type="dxa"/>
@@ -1486,12 +3656,6 @@
         </w:tc>
       </w:tr>
       <w:tr>
-        <w:tblPrEx>
-          <w:tblCellMar>
-            <w:top w:w="0" w:type="dxa"/>
-            <w:bottom w:w="0" w:type="dxa"/>
-          </w:tblCellMar>
-        </w:tblPrEx>
         <w:tc>
           <w:tcPr>
             <w:tcW w:w="1700" w:type="dxa"/>
@@ -1554,12 +3718,6 @@
         </w:tc>
       </w:tr>
       <w:tr>
-        <w:tblPrEx>
-          <w:tblCellMar>
-            <w:top w:w="0" w:type="dxa"/>
-            <w:bottom w:w="0" w:type="dxa"/>
-          </w:tblCellMar>
-        </w:tblPrEx>
         <w:tc>
           <w:tcPr>
             <w:tcW w:w="1700" w:type="dxa"/>
@@ -1630,6 +3788,7 @@
         <w:pStyle w:val="Ttulo1"/>
         <w:spacing w:before="320" w:after="140"/>
       </w:pPr>
+      <w:bookmarkStart w:id="10" w:name="_Toc235227427"/>
       <w:r>
         <w:rPr>
           <w:b/>
@@ -1640,12 +3799,14 @@
         </w:rPr>
         <w:t>5. Alcance del MVP y canon ético</w:t>
       </w:r>
+      <w:bookmarkEnd w:id="10"/>
     </w:p>
     <w:p>
       <w:pPr>
         <w:pStyle w:val="Ttulo2"/>
         <w:spacing w:before="220" w:after="100"/>
       </w:pPr>
+      <w:bookmarkStart w:id="11" w:name="_Toc235227428"/>
       <w:r>
         <w:rPr>
           <w:b/>
@@ -1656,6 +3817,7 @@
         </w:rPr>
         <w:t>5.1. Qué sí entra en el MVP</w:t>
       </w:r>
+      <w:bookmarkEnd w:id="11"/>
     </w:p>
     <w:p>
       <w:pPr>
@@ -1687,6 +3849,7 @@
         <w:pStyle w:val="Ttulo2"/>
         <w:spacing w:before="220" w:after="100"/>
       </w:pPr>
+      <w:bookmarkStart w:id="12" w:name="_Toc235227429"/>
       <w:r>
         <w:rPr>
           <w:b/>
@@ -1697,6 +3860,7 @@
         </w:rPr>
         <w:t>5.2. Qué queda fuera de alcance</w:t>
       </w:r>
+      <w:bookmarkEnd w:id="12"/>
     </w:p>
     <w:p>
       <w:pPr>
@@ -1736,6 +3900,7 @@
         <w:pStyle w:val="Ttulo2"/>
         <w:spacing w:before="220" w:after="100"/>
       </w:pPr>
+      <w:bookmarkStart w:id="13" w:name="_Toc235227430"/>
       <w:r>
         <w:rPr>
           <w:b/>
@@ -1747,6 +3912,7 @@
         <w:lastRenderedPageBreak/>
         <w:t>5.3. Canon ético de dominio</w:t>
       </w:r>
+      <w:bookmarkEnd w:id="13"/>
     </w:p>
     <w:p>
       <w:pPr>
@@ -1886,6 +4052,7 @@
         <w:pStyle w:val="Ttulo1"/>
         <w:spacing w:before="320" w:after="140"/>
       </w:pPr>
+      <w:bookmarkStart w:id="14" w:name="_Toc235227431"/>
       <w:r>
         <w:rPr>
           <w:b/>
@@ -1896,6 +4063,7 @@
         </w:rPr>
         <w:t>6. Desarrollo del proyecto</w:t>
       </w:r>
+      <w:bookmarkEnd w:id="14"/>
     </w:p>
     <w:p>
       <w:pPr>
@@ -1903,7 +4071,15 @@
         <w:jc w:val="both"/>
       </w:pPr>
       <w:r>
-        <w:t>A continuación se describen los artefactos producidos, organizados por fase. Cada artefacto lleva un identificador estable, ficha de control (insumos, consumidores, versión) y trazabilidad hacia atrás y hacia adelante.</w:t>
+        <w:t xml:space="preserve">A </w:t>
+      </w:r>
+      <w:proofErr w:type="gramStart"/>
+      <w:r>
+        <w:t>continuación</w:t>
+      </w:r>
+      <w:proofErr w:type="gramEnd"/>
+      <w:r>
+        <w:t xml:space="preserve"> se describen los artefactos producidos, organizados por fase. Cada artefacto lleva un identificador estable, ficha de control (insumos, consumidores, versión) y trazabilidad hacia atrás y hacia adelante.</w:t>
       </w:r>
     </w:p>
     <w:p>
@@ -1911,6 +4087,7 @@
         <w:pStyle w:val="Ttulo2"/>
         <w:spacing w:before="220" w:after="100"/>
       </w:pPr>
+      <w:bookmarkStart w:id="15" w:name="_Toc235227432"/>
       <w:r>
         <w:rPr>
           <w:b/>
@@ -1921,6 +4098,7 @@
         </w:rPr>
         <w:t>6.1. Fase 1 — Paquete documental</w:t>
       </w:r>
+      <w:bookmarkEnd w:id="15"/>
     </w:p>
     <w:p>
       <w:pPr>
@@ -1953,12 +4131,6 @@
         <w:gridCol w:w="6760"/>
       </w:tblGrid>
       <w:tr>
-        <w:tblPrEx>
-          <w:tblCellMar>
-            <w:top w:w="0" w:type="dxa"/>
-            <w:bottom w:w="0" w:type="dxa"/>
-          </w:tblCellMar>
-        </w:tblPrEx>
         <w:trPr>
           <w:tblHeader/>
         </w:trPr>
@@ -2012,12 +4184,6 @@
         </w:tc>
       </w:tr>
       <w:tr>
-        <w:tblPrEx>
-          <w:tblCellMar>
-            <w:top w:w="0" w:type="dxa"/>
-            <w:bottom w:w="0" w:type="dxa"/>
-          </w:tblCellMar>
-        </w:tblPrEx>
         <w:tc>
           <w:tcPr>
             <w:tcW w:w="2600" w:type="dxa"/>
@@ -2060,12 +4226,6 @@
         </w:tc>
       </w:tr>
       <w:tr>
-        <w:tblPrEx>
-          <w:tblCellMar>
-            <w:top w:w="0" w:type="dxa"/>
-            <w:bottom w:w="0" w:type="dxa"/>
-          </w:tblCellMar>
-        </w:tblPrEx>
         <w:tc>
           <w:tcPr>
             <w:tcW w:w="2600" w:type="dxa"/>
@@ -2126,12 +4286,6 @@
         </w:tc>
       </w:tr>
       <w:tr>
-        <w:tblPrEx>
-          <w:tblCellMar>
-            <w:top w:w="0" w:type="dxa"/>
-            <w:bottom w:w="0" w:type="dxa"/>
-          </w:tblCellMar>
-        </w:tblPrEx>
         <w:tc>
           <w:tcPr>
             <w:tcW w:w="2600" w:type="dxa"/>
@@ -2190,12 +4344,6 @@
         </w:tc>
       </w:tr>
       <w:tr>
-        <w:tblPrEx>
-          <w:tblCellMar>
-            <w:top w:w="0" w:type="dxa"/>
-            <w:bottom w:w="0" w:type="dxa"/>
-          </w:tblCellMar>
-        </w:tblPrEx>
         <w:tc>
           <w:tcPr>
             <w:tcW w:w="2600" w:type="dxa"/>
@@ -2240,12 +4388,6 @@
         </w:tc>
       </w:tr>
       <w:tr>
-        <w:tblPrEx>
-          <w:tblCellMar>
-            <w:top w:w="0" w:type="dxa"/>
-            <w:bottom w:w="0" w:type="dxa"/>
-          </w:tblCellMar>
-        </w:tblPrEx>
         <w:tc>
           <w:tcPr>
             <w:tcW w:w="2600" w:type="dxa"/>
@@ -2288,12 +4430,6 @@
         </w:tc>
       </w:tr>
       <w:tr>
-        <w:tblPrEx>
-          <w:tblCellMar>
-            <w:top w:w="0" w:type="dxa"/>
-            <w:bottom w:w="0" w:type="dxa"/>
-          </w:tblCellMar>
-        </w:tblPrEx>
         <w:tc>
           <w:tcPr>
             <w:tcW w:w="2600" w:type="dxa"/>
@@ -2338,12 +4474,6 @@
         </w:tc>
       </w:tr>
       <w:tr>
-        <w:tblPrEx>
-          <w:tblCellMar>
-            <w:top w:w="0" w:type="dxa"/>
-            <w:bottom w:w="0" w:type="dxa"/>
-          </w:tblCellMar>
-        </w:tblPrEx>
         <w:tc>
           <w:tcPr>
             <w:tcW w:w="2600" w:type="dxa"/>
@@ -2402,12 +4532,6 @@
         </w:tc>
       </w:tr>
       <w:tr>
-        <w:tblPrEx>
-          <w:tblCellMar>
-            <w:top w:w="0" w:type="dxa"/>
-            <w:bottom w:w="0" w:type="dxa"/>
-          </w:tblCellMar>
-        </w:tblPrEx>
         <w:tc>
           <w:tcPr>
             <w:tcW w:w="2600" w:type="dxa"/>
@@ -2452,12 +4576,6 @@
         </w:tc>
       </w:tr>
       <w:tr>
-        <w:tblPrEx>
-          <w:tblCellMar>
-            <w:top w:w="0" w:type="dxa"/>
-            <w:bottom w:w="0" w:type="dxa"/>
-          </w:tblCellMar>
-        </w:tblPrEx>
         <w:tc>
           <w:tcPr>
             <w:tcW w:w="2600" w:type="dxa"/>
@@ -2500,12 +4618,6 @@
         </w:tc>
       </w:tr>
       <w:tr>
-        <w:tblPrEx>
-          <w:tblCellMar>
-            <w:top w:w="0" w:type="dxa"/>
-            <w:bottom w:w="0" w:type="dxa"/>
-          </w:tblCellMar>
-        </w:tblPrEx>
         <w:tc>
           <w:tcPr>
             <w:tcW w:w="2600" w:type="dxa"/>
@@ -2587,6 +4699,7 @@
         <w:pStyle w:val="Ttulo2"/>
         <w:spacing w:before="220" w:after="100"/>
       </w:pPr>
+      <w:bookmarkStart w:id="16" w:name="_Toc235227433"/>
       <w:r>
         <w:rPr>
           <w:b/>
@@ -2598,6 +4711,7 @@
         <w:lastRenderedPageBreak/>
         <w:t>6.2. Fase 2 — Análisis y diseño ICONIX</w:t>
       </w:r>
+      <w:bookmarkEnd w:id="16"/>
     </w:p>
     <w:p>
       <w:pPr>
@@ -2613,6 +4727,7 @@
         <w:pStyle w:val="Ttulo2"/>
         <w:spacing w:before="120" w:after="80"/>
       </w:pPr>
+      <w:bookmarkStart w:id="17" w:name="_Toc235227434"/>
       <w:r>
         <w:rPr>
           <w:b/>
@@ -2623,6 +4738,7 @@
         </w:rPr>
         <w:t>6.2.1. Modelo de dominio (MD-01)</w:t>
       </w:r>
+      <w:bookmarkEnd w:id="17"/>
     </w:p>
     <w:p>
       <w:pPr>
@@ -2710,6 +4826,7 @@
         <w:pStyle w:val="Ttulo2"/>
         <w:spacing w:before="120" w:after="80"/>
       </w:pPr>
+      <w:bookmarkStart w:id="18" w:name="_Toc235227435"/>
       <w:r>
         <w:rPr>
           <w:b/>
@@ -2720,6 +4837,7 @@
         </w:rPr>
         <w:t>6.2.2. Diagrama de casos de uso (DCU-01)</w:t>
       </w:r>
+      <w:bookmarkEnd w:id="18"/>
     </w:p>
     <w:p>
       <w:pPr>
@@ -2777,12 +4895,6 @@
         <w:gridCol w:w="2100"/>
       </w:tblGrid>
       <w:tr>
-        <w:tblPrEx>
-          <w:tblCellMar>
-            <w:top w:w="0" w:type="dxa"/>
-            <w:bottom w:w="0" w:type="dxa"/>
-          </w:tblCellMar>
-        </w:tblPrEx>
         <w:trPr>
           <w:tblHeader/>
         </w:trPr>
@@ -2860,12 +4972,6 @@
         </w:tc>
       </w:tr>
       <w:tr>
-        <w:tblPrEx>
-          <w:tblCellMar>
-            <w:top w:w="0" w:type="dxa"/>
-            <w:bottom w:w="0" w:type="dxa"/>
-          </w:tblCellMar>
-        </w:tblPrEx>
         <w:tc>
           <w:tcPr>
             <w:tcW w:w="4560" w:type="dxa"/>
@@ -2928,12 +5034,6 @@
         </w:tc>
       </w:tr>
       <w:tr>
-        <w:tblPrEx>
-          <w:tblCellMar>
-            <w:top w:w="0" w:type="dxa"/>
-            <w:bottom w:w="0" w:type="dxa"/>
-          </w:tblCellMar>
-        </w:tblPrEx>
         <w:tc>
           <w:tcPr>
             <w:tcW w:w="4560" w:type="dxa"/>
@@ -2999,12 +5099,6 @@
         </w:tc>
       </w:tr>
       <w:tr>
-        <w:tblPrEx>
-          <w:tblCellMar>
-            <w:top w:w="0" w:type="dxa"/>
-            <w:bottom w:w="0" w:type="dxa"/>
-          </w:tblCellMar>
-        </w:tblPrEx>
         <w:tc>
           <w:tcPr>
             <w:tcW w:w="4560" w:type="dxa"/>
@@ -3067,12 +5161,6 @@
         </w:tc>
       </w:tr>
       <w:tr>
-        <w:tblPrEx>
-          <w:tblCellMar>
-            <w:top w:w="0" w:type="dxa"/>
-            <w:bottom w:w="0" w:type="dxa"/>
-          </w:tblCellMar>
-        </w:tblPrEx>
         <w:tc>
           <w:tcPr>
             <w:tcW w:w="4560" w:type="dxa"/>
@@ -3138,12 +5226,6 @@
         </w:tc>
       </w:tr>
       <w:tr>
-        <w:tblPrEx>
-          <w:tblCellMar>
-            <w:top w:w="0" w:type="dxa"/>
-            <w:bottom w:w="0" w:type="dxa"/>
-          </w:tblCellMar>
-        </w:tblPrEx>
         <w:tc>
           <w:tcPr>
             <w:tcW w:w="4560" w:type="dxa"/>
@@ -3206,12 +5288,6 @@
         </w:tc>
       </w:tr>
       <w:tr>
-        <w:tblPrEx>
-          <w:tblCellMar>
-            <w:top w:w="0" w:type="dxa"/>
-            <w:bottom w:w="0" w:type="dxa"/>
-          </w:tblCellMar>
-        </w:tblPrEx>
         <w:tc>
           <w:tcPr>
             <w:tcW w:w="4560" w:type="dxa"/>
@@ -3277,12 +5353,6 @@
         </w:tc>
       </w:tr>
       <w:tr>
-        <w:tblPrEx>
-          <w:tblCellMar>
-            <w:top w:w="0" w:type="dxa"/>
-            <w:bottom w:w="0" w:type="dxa"/>
-          </w:tblCellMar>
-        </w:tblPrEx>
         <w:tc>
           <w:tcPr>
             <w:tcW w:w="4560" w:type="dxa"/>
@@ -3361,12 +5431,6 @@
         </w:tc>
       </w:tr>
       <w:tr>
-        <w:tblPrEx>
-          <w:tblCellMar>
-            <w:top w:w="0" w:type="dxa"/>
-            <w:bottom w:w="0" w:type="dxa"/>
-          </w:tblCellMar>
-        </w:tblPrEx>
         <w:tc>
           <w:tcPr>
             <w:tcW w:w="4560" w:type="dxa"/>
@@ -3432,12 +5496,6 @@
         </w:tc>
       </w:tr>
       <w:tr>
-        <w:tblPrEx>
-          <w:tblCellMar>
-            <w:top w:w="0" w:type="dxa"/>
-            <w:bottom w:w="0" w:type="dxa"/>
-          </w:tblCellMar>
-        </w:tblPrEx>
         <w:tc>
           <w:tcPr>
             <w:tcW w:w="4560" w:type="dxa"/>
@@ -3500,12 +5558,6 @@
         </w:tc>
       </w:tr>
       <w:tr>
-        <w:tblPrEx>
-          <w:tblCellMar>
-            <w:top w:w="0" w:type="dxa"/>
-            <w:bottom w:w="0" w:type="dxa"/>
-          </w:tblCellMar>
-        </w:tblPrEx>
         <w:tc>
           <w:tcPr>
             <w:tcW w:w="4560" w:type="dxa"/>
@@ -3585,6 +5637,7 @@
         <w:pStyle w:val="Ttulo2"/>
         <w:spacing w:before="120" w:after="80"/>
       </w:pPr>
+      <w:bookmarkStart w:id="19" w:name="_Toc235227436"/>
       <w:r>
         <w:rPr>
           <w:b/>
@@ -3595,6 +5648,7 @@
         </w:rPr>
         <w:t>6.2.3. Especificación de los casos de uso (ECU-00…ECU-10)</w:t>
       </w:r>
+      <w:bookmarkEnd w:id="19"/>
     </w:p>
     <w:p>
       <w:pPr>
@@ -3634,6 +5688,7 @@
         <w:pStyle w:val="Ttulo2"/>
         <w:spacing w:before="220" w:after="100"/>
       </w:pPr>
+      <w:bookmarkStart w:id="20" w:name="_Toc235227437"/>
       <w:r>
         <w:rPr>
           <w:b/>
@@ -3644,6 +5699,7 @@
         </w:rPr>
         <w:t>6.3. Reconciliaciones con la fuente primaria</w:t>
       </w:r>
+      <w:bookmarkEnd w:id="20"/>
     </w:p>
     <w:p>
       <w:pPr>
@@ -3676,6 +5732,7 @@
         <w:pStyle w:val="Ttulo2"/>
         <w:spacing w:before="220" w:after="100"/>
       </w:pPr>
+      <w:bookmarkStart w:id="21" w:name="_Toc235227438"/>
       <w:r>
         <w:rPr>
           <w:b/>
@@ -3686,6 +5743,7 @@
         </w:rPr>
         <w:t>6.4. Diseño de interfaz — sistema y mockups</w:t>
       </w:r>
+      <w:bookmarkEnd w:id="21"/>
     </w:p>
     <w:p>
       <w:pPr>
@@ -3752,12 +5810,6 @@
         <w:gridCol w:w="5960"/>
       </w:tblGrid>
       <w:tr>
-        <w:tblPrEx>
-          <w:tblCellMar>
-            <w:top w:w="0" w:type="dxa"/>
-            <w:bottom w:w="0" w:type="dxa"/>
-          </w:tblCellMar>
-        </w:tblPrEx>
         <w:trPr>
           <w:tblHeader/>
         </w:trPr>
@@ -3811,12 +5863,6 @@
         </w:tc>
       </w:tr>
       <w:tr>
-        <w:tblPrEx>
-          <w:tblCellMar>
-            <w:top w:w="0" w:type="dxa"/>
-            <w:bottom w:w="0" w:type="dxa"/>
-          </w:tblCellMar>
-        </w:tblPrEx>
         <w:tc>
           <w:tcPr>
             <w:tcW w:w="3400" w:type="dxa"/>
@@ -3907,12 +5953,6 @@
         </w:tc>
       </w:tr>
       <w:tr>
-        <w:tblPrEx>
-          <w:tblCellMar>
-            <w:top w:w="0" w:type="dxa"/>
-            <w:bottom w:w="0" w:type="dxa"/>
-          </w:tblCellMar>
-        </w:tblPrEx>
         <w:tc>
           <w:tcPr>
             <w:tcW w:w="3400" w:type="dxa"/>
@@ -3957,12 +5997,6 @@
         </w:tc>
       </w:tr>
       <w:tr>
-        <w:tblPrEx>
-          <w:tblCellMar>
-            <w:top w:w="0" w:type="dxa"/>
-            <w:bottom w:w="0" w:type="dxa"/>
-          </w:tblCellMar>
-        </w:tblPrEx>
         <w:tc>
           <w:tcPr>
             <w:tcW w:w="3400" w:type="dxa"/>
@@ -4005,12 +6039,6 @@
         </w:tc>
       </w:tr>
       <w:tr>
-        <w:tblPrEx>
-          <w:tblCellMar>
-            <w:top w:w="0" w:type="dxa"/>
-            <w:bottom w:w="0" w:type="dxa"/>
-          </w:tblCellMar>
-        </w:tblPrEx>
         <w:tc>
           <w:tcPr>
             <w:tcW w:w="3400" w:type="dxa"/>
@@ -4065,18 +6093,28 @@
                 <w:sz w:val="19"/>
                 <w:szCs w:val="19"/>
               </w:rPr>
-              <w:t>-in explícito, con interruptores apagados por defecto y lenguaje llano.</w:t>
+              <w:t>-</w:t>
+            </w:r>
+            <w:proofErr w:type="gramStart"/>
+            <w:r>
+              <w:rPr>
+                <w:sz w:val="19"/>
+                <w:szCs w:val="19"/>
+              </w:rPr>
+              <w:t>in explícito</w:t>
+            </w:r>
+            <w:proofErr w:type="gramEnd"/>
+            <w:r>
+              <w:rPr>
+                <w:sz w:val="19"/>
+                <w:szCs w:val="19"/>
+              </w:rPr>
+              <w:t>, con interruptores apagados por defecto y lenguaje llano.</w:t>
             </w:r>
           </w:p>
         </w:tc>
       </w:tr>
       <w:tr>
-        <w:tblPrEx>
-          <w:tblCellMar>
-            <w:top w:w="0" w:type="dxa"/>
-            <w:bottom w:w="0" w:type="dxa"/>
-          </w:tblCellMar>
-        </w:tblPrEx>
         <w:tc>
           <w:tcPr>
             <w:tcW w:w="3400" w:type="dxa"/>
@@ -4119,12 +6157,6 @@
         </w:tc>
       </w:tr>
       <w:tr>
-        <w:tblPrEx>
-          <w:tblCellMar>
-            <w:top w:w="0" w:type="dxa"/>
-            <w:bottom w:w="0" w:type="dxa"/>
-          </w:tblCellMar>
-        </w:tblPrEx>
         <w:tc>
           <w:tcPr>
             <w:tcW w:w="3400" w:type="dxa"/>
@@ -4232,6 +6264,7 @@
         <w:pStyle w:val="Ttulo1"/>
         <w:spacing w:before="320" w:after="140"/>
       </w:pPr>
+      <w:bookmarkStart w:id="22" w:name="_Toc235227439"/>
       <w:r>
         <w:rPr>
           <w:b/>
@@ -4243,6 +6276,7 @@
         <w:lastRenderedPageBreak/>
         <w:t>7. Arquitectura y decisiones técnicas</w:t>
       </w:r>
+      <w:bookmarkEnd w:id="22"/>
     </w:p>
     <w:p>
       <w:pPr>
@@ -4276,12 +6310,6 @@
         <w:gridCol w:w="4100"/>
       </w:tblGrid>
       <w:tr>
-        <w:tblPrEx>
-          <w:tblCellMar>
-            <w:top w:w="0" w:type="dxa"/>
-            <w:bottom w:w="0" w:type="dxa"/>
-          </w:tblCellMar>
-        </w:tblPrEx>
         <w:trPr>
           <w:tblHeader/>
         </w:trPr>
@@ -4359,12 +6387,6 @@
         </w:tc>
       </w:tr>
       <w:tr>
-        <w:tblPrEx>
-          <w:tblCellMar>
-            <w:top w:w="0" w:type="dxa"/>
-            <w:bottom w:w="0" w:type="dxa"/>
-          </w:tblCellMar>
-        </w:tblPrEx>
         <w:tc>
           <w:tcPr>
             <w:tcW w:w="2100" w:type="dxa"/>
@@ -4436,12 +6458,6 @@
         </w:tc>
       </w:tr>
       <w:tr>
-        <w:tblPrEx>
-          <w:tblCellMar>
-            <w:top w:w="0" w:type="dxa"/>
-            <w:bottom w:w="0" w:type="dxa"/>
-          </w:tblCellMar>
-        </w:tblPrEx>
         <w:tc>
           <w:tcPr>
             <w:tcW w:w="2100" w:type="dxa"/>
@@ -4507,12 +6523,6 @@
         </w:tc>
       </w:tr>
       <w:tr>
-        <w:tblPrEx>
-          <w:tblCellMar>
-            <w:top w:w="0" w:type="dxa"/>
-            <w:bottom w:w="0" w:type="dxa"/>
-          </w:tblCellMar>
-        </w:tblPrEx>
         <w:tc>
           <w:tcPr>
             <w:tcW w:w="2100" w:type="dxa"/>
@@ -4591,12 +6601,6 @@
         </w:tc>
       </w:tr>
       <w:tr>
-        <w:tblPrEx>
-          <w:tblCellMar>
-            <w:top w:w="0" w:type="dxa"/>
-            <w:bottom w:w="0" w:type="dxa"/>
-          </w:tblCellMar>
-        </w:tblPrEx>
         <w:tc>
           <w:tcPr>
             <w:tcW w:w="2100" w:type="dxa"/>
@@ -4671,12 +6675,6 @@
         </w:tc>
       </w:tr>
       <w:tr>
-        <w:tblPrEx>
-          <w:tblCellMar>
-            <w:top w:w="0" w:type="dxa"/>
-            <w:bottom w:w="0" w:type="dxa"/>
-          </w:tblCellMar>
-        </w:tblPrEx>
         <w:tc>
           <w:tcPr>
             <w:tcW w:w="2100" w:type="dxa"/>
@@ -4764,12 +6762,6 @@
         </w:tc>
       </w:tr>
       <w:tr>
-        <w:tblPrEx>
-          <w:tblCellMar>
-            <w:top w:w="0" w:type="dxa"/>
-            <w:bottom w:w="0" w:type="dxa"/>
-          </w:tblCellMar>
-        </w:tblPrEx>
         <w:tc>
           <w:tcPr>
             <w:tcW w:w="2100" w:type="dxa"/>
@@ -4849,7 +6841,15 @@
       </w:r>
       <w:proofErr w:type="spellEnd"/>
       <w:r>
-        <w:t xml:space="preserve"> de contención son deterministas y locales, de modo que operan aunque el modelo de lenguaje esté caído (principio </w:t>
+        <w:t xml:space="preserve"> de contención son deterministas y locales, de modo que </w:t>
+      </w:r>
+      <w:proofErr w:type="gramStart"/>
+      <w:r>
+        <w:t>operan</w:t>
+      </w:r>
+      <w:proofErr w:type="gramEnd"/>
+      <w:r>
+        <w:t xml:space="preserve"> aunque el modelo de lenguaje esté caído (principio </w:t>
       </w:r>
       <w:proofErr w:type="spellStart"/>
       <w:r>
@@ -4865,6 +6865,7 @@
         <w:pStyle w:val="Ttulo1"/>
         <w:spacing w:before="320" w:after="140"/>
       </w:pPr>
+      <w:bookmarkStart w:id="23" w:name="_Toc235227440"/>
       <w:r>
         <w:rPr>
           <w:b/>
@@ -4875,6 +6876,7 @@
         </w:rPr>
         <w:t>8. Trazabilidad y verificación</w:t>
       </w:r>
+      <w:bookmarkEnd w:id="23"/>
     </w:p>
     <w:p>
       <w:pPr>
@@ -4890,6 +6892,7 @@
         <w:pStyle w:val="Ttulo1"/>
         <w:spacing w:before="320" w:after="140"/>
       </w:pPr>
+      <w:bookmarkStart w:id="24" w:name="_Toc235227441"/>
       <w:r>
         <w:rPr>
           <w:b/>
@@ -4900,6 +6903,7 @@
         </w:rPr>
         <w:t>9. Requisitos de calidad (ISO/IEC 25010:2023 + GQM)</w:t>
       </w:r>
+      <w:bookmarkEnd w:id="24"/>
     </w:p>
     <w:p>
       <w:pPr>
@@ -4933,12 +6937,6 @@
         <w:gridCol w:w="3900"/>
       </w:tblGrid>
       <w:tr>
-        <w:tblPrEx>
-          <w:tblCellMar>
-            <w:top w:w="0" w:type="dxa"/>
-            <w:bottom w:w="0" w:type="dxa"/>
-          </w:tblCellMar>
-        </w:tblPrEx>
         <w:trPr>
           <w:tblHeader/>
         </w:trPr>
@@ -5016,12 +7014,6 @@
         </w:tc>
       </w:tr>
       <w:tr>
-        <w:tblPrEx>
-          <w:tblCellMar>
-            <w:top w:w="0" w:type="dxa"/>
-            <w:bottom w:w="0" w:type="dxa"/>
-          </w:tblCellMar>
-        </w:tblPrEx>
         <w:tc>
           <w:tcPr>
             <w:tcW w:w="900" w:type="dxa"/>
@@ -5116,12 +7108,6 @@
         </w:tc>
       </w:tr>
       <w:tr>
-        <w:tblPrEx>
-          <w:tblCellMar>
-            <w:top w:w="0" w:type="dxa"/>
-            <w:bottom w:w="0" w:type="dxa"/>
-          </w:tblCellMar>
-        </w:tblPrEx>
         <w:tc>
           <w:tcPr>
             <w:tcW w:w="900" w:type="dxa"/>
@@ -5228,12 +7214,6 @@
         </w:tc>
       </w:tr>
       <w:tr>
-        <w:tblPrEx>
-          <w:tblCellMar>
-            <w:top w:w="0" w:type="dxa"/>
-            <w:bottom w:w="0" w:type="dxa"/>
-          </w:tblCellMar>
-        </w:tblPrEx>
         <w:tc>
           <w:tcPr>
             <w:tcW w:w="900" w:type="dxa"/>
@@ -5344,12 +7324,6 @@
         </w:tc>
       </w:tr>
       <w:tr>
-        <w:tblPrEx>
-          <w:tblCellMar>
-            <w:top w:w="0" w:type="dxa"/>
-            <w:bottom w:w="0" w:type="dxa"/>
-          </w:tblCellMar>
-        </w:tblPrEx>
         <w:tc>
           <w:tcPr>
             <w:tcW w:w="900" w:type="dxa"/>
@@ -5416,12 +7390,6 @@
         </w:tc>
       </w:tr>
       <w:tr>
-        <w:tblPrEx>
-          <w:tblCellMar>
-            <w:top w:w="0" w:type="dxa"/>
-            <w:bottom w:w="0" w:type="dxa"/>
-          </w:tblCellMar>
-        </w:tblPrEx>
         <w:tc>
           <w:tcPr>
             <w:tcW w:w="900" w:type="dxa"/>
@@ -5500,12 +7468,6 @@
         </w:tc>
       </w:tr>
       <w:tr>
-        <w:tblPrEx>
-          <w:tblCellMar>
-            <w:top w:w="0" w:type="dxa"/>
-            <w:bottom w:w="0" w:type="dxa"/>
-          </w:tblCellMar>
-        </w:tblPrEx>
         <w:tc>
           <w:tcPr>
             <w:tcW w:w="900" w:type="dxa"/>
@@ -5612,12 +7574,6 @@
         </w:tc>
       </w:tr>
       <w:tr>
-        <w:tblPrEx>
-          <w:tblCellMar>
-            <w:top w:w="0" w:type="dxa"/>
-            <w:bottom w:w="0" w:type="dxa"/>
-          </w:tblCellMar>
-        </w:tblPrEx>
         <w:tc>
           <w:tcPr>
             <w:tcW w:w="900" w:type="dxa"/>
@@ -5705,12 +7661,6 @@
         </w:tc>
       </w:tr>
       <w:tr>
-        <w:tblPrEx>
-          <w:tblCellMar>
-            <w:top w:w="0" w:type="dxa"/>
-            <w:bottom w:w="0" w:type="dxa"/>
-          </w:tblCellMar>
-        </w:tblPrEx>
         <w:tc>
           <w:tcPr>
             <w:tcW w:w="900" w:type="dxa"/>
@@ -5801,12 +7751,6 @@
         </w:tc>
       </w:tr>
       <w:tr>
-        <w:tblPrEx>
-          <w:tblCellMar>
-            <w:top w:w="0" w:type="dxa"/>
-            <w:bottom w:w="0" w:type="dxa"/>
-          </w:tblCellMar>
-        </w:tblPrEx>
         <w:tc>
           <w:tcPr>
             <w:tcW w:w="900" w:type="dxa"/>
@@ -5903,12 +7847,6 @@
         </w:tc>
       </w:tr>
       <w:tr>
-        <w:tblPrEx>
-          <w:tblCellMar>
-            <w:top w:w="0" w:type="dxa"/>
-            <w:bottom w:w="0" w:type="dxa"/>
-          </w:tblCellMar>
-        </w:tblPrEx>
         <w:tc>
           <w:tcPr>
             <w:tcW w:w="900" w:type="dxa"/>
@@ -5997,6 +7935,7 @@
         <w:pStyle w:val="Ttulo1"/>
         <w:spacing w:before="320" w:after="140"/>
       </w:pPr>
+      <w:bookmarkStart w:id="25" w:name="_Toc235227442"/>
       <w:r>
         <w:rPr>
           <w:b/>
@@ -6007,6 +7946,7 @@
         </w:rPr>
         <w:t>10. Resultados y estado actual</w:t>
       </w:r>
+      <w:bookmarkEnd w:id="25"/>
     </w:p>
     <w:p>
       <w:pPr>
@@ -6095,6 +8035,7 @@
         <w:pStyle w:val="Ttulo1"/>
         <w:spacing w:before="320" w:after="140"/>
       </w:pPr>
+      <w:bookmarkStart w:id="26" w:name="_Toc235227443"/>
       <w:r>
         <w:rPr>
           <w:b/>
@@ -6105,6 +8046,7 @@
         </w:rPr>
         <w:t>11. Conclusiones y trabajo futuro</w:t>
       </w:r>
+      <w:bookmarkEnd w:id="26"/>
     </w:p>
     <w:p>
       <w:pPr>
@@ -6149,6 +8091,7 @@
         <w:pStyle w:val="Ttulo1"/>
         <w:spacing w:before="320" w:after="140"/>
       </w:pPr>
+      <w:bookmarkStart w:id="27" w:name="_Toc235227444"/>
       <w:r>
         <w:rPr>
           <w:b/>
@@ -6159,6 +8102,7 @@
         </w:rPr>
         <w:t>12. Referencias</w:t>
       </w:r>
+      <w:bookmarkEnd w:id="27"/>
     </w:p>
     <w:p>
       <w:pPr>
@@ -6347,23 +8291,7 @@
           <w:sz w:val="21"/>
           <w:szCs w:val="21"/>
         </w:rPr>
-        <w:t xml:space="preserve"> </w:t>
-      </w:r>
-      <w:proofErr w:type="spellStart"/>
-      <w:r>
-        <w:rPr>
-          <w:sz w:val="21"/>
-          <w:szCs w:val="21"/>
-        </w:rPr>
-        <w:t>for</w:t>
-      </w:r>
-      <w:proofErr w:type="spellEnd"/>
-      <w:r>
-        <w:rPr>
-          <w:sz w:val="21"/>
-          <w:szCs w:val="21"/>
-        </w:rPr>
-        <w:t xml:space="preserve"> </w:t>
+        <w:t xml:space="preserve"> for </w:t>
       </w:r>
       <w:proofErr w:type="spellStart"/>
       <w:r>
@@ -7013,6 +8941,7 @@
         <w:pStyle w:val="Ttulo1"/>
         <w:spacing w:before="320" w:after="140"/>
       </w:pPr>
+      <w:bookmarkStart w:id="28" w:name="_Toc235227445"/>
       <w:r>
         <w:rPr>
           <w:b/>
@@ -7023,12 +8952,14 @@
         </w:rPr>
         <w:t>13. Anexos</w:t>
       </w:r>
+      <w:bookmarkEnd w:id="28"/>
     </w:p>
     <w:p>
       <w:pPr>
         <w:pStyle w:val="Ttulo2"/>
         <w:spacing w:before="220" w:after="100"/>
       </w:pPr>
+      <w:bookmarkStart w:id="29" w:name="_Toc235227446"/>
       <w:r>
         <w:rPr>
           <w:b/>
@@ -7039,6 +8970,7 @@
         </w:rPr>
         <w:t>Anexo A. Índice de artefactos del proyecto</w:t>
       </w:r>
+      <w:bookmarkEnd w:id="29"/>
     </w:p>
     <w:tbl>
       <w:tblPr>
@@ -7062,12 +8994,6 @@
         <w:gridCol w:w="6860"/>
       </w:tblGrid>
       <w:tr>
-        <w:tblPrEx>
-          <w:tblCellMar>
-            <w:top w:w="0" w:type="dxa"/>
-            <w:bottom w:w="0" w:type="dxa"/>
-          </w:tblCellMar>
-        </w:tblPrEx>
         <w:trPr>
           <w:tblHeader/>
         </w:trPr>
@@ -7121,12 +9047,6 @@
         </w:tc>
       </w:tr>
       <w:tr>
-        <w:tblPrEx>
-          <w:tblCellMar>
-            <w:top w:w="0" w:type="dxa"/>
-            <w:bottom w:w="0" w:type="dxa"/>
-          </w:tblCellMar>
-        </w:tblPrEx>
         <w:tc>
           <w:tcPr>
             <w:tcW w:w="2500" w:type="dxa"/>
@@ -7169,12 +9089,6 @@
         </w:tc>
       </w:tr>
       <w:tr>
-        <w:tblPrEx>
-          <w:tblCellMar>
-            <w:top w:w="0" w:type="dxa"/>
-            <w:bottom w:w="0" w:type="dxa"/>
-          </w:tblCellMar>
-        </w:tblPrEx>
         <w:tc>
           <w:tcPr>
             <w:tcW w:w="2500" w:type="dxa"/>
@@ -7219,12 +9133,6 @@
         </w:tc>
       </w:tr>
       <w:tr>
-        <w:tblPrEx>
-          <w:tblCellMar>
-            <w:top w:w="0" w:type="dxa"/>
-            <w:bottom w:w="0" w:type="dxa"/>
-          </w:tblCellMar>
-        </w:tblPrEx>
         <w:tc>
           <w:tcPr>
             <w:tcW w:w="2500" w:type="dxa"/>
@@ -7267,12 +9175,6 @@
         </w:tc>
       </w:tr>
       <w:tr>
-        <w:tblPrEx>
-          <w:tblCellMar>
-            <w:top w:w="0" w:type="dxa"/>
-            <w:bottom w:w="0" w:type="dxa"/>
-          </w:tblCellMar>
-        </w:tblPrEx>
         <w:tc>
           <w:tcPr>
             <w:tcW w:w="2500" w:type="dxa"/>
@@ -7317,12 +9219,6 @@
         </w:tc>
       </w:tr>
       <w:tr>
-        <w:tblPrEx>
-          <w:tblCellMar>
-            <w:top w:w="0" w:type="dxa"/>
-            <w:bottom w:w="0" w:type="dxa"/>
-          </w:tblCellMar>
-        </w:tblPrEx>
         <w:tc>
           <w:tcPr>
             <w:tcW w:w="2500" w:type="dxa"/>
@@ -7365,12 +9261,6 @@
         </w:tc>
       </w:tr>
       <w:tr>
-        <w:tblPrEx>
-          <w:tblCellMar>
-            <w:top w:w="0" w:type="dxa"/>
-            <w:bottom w:w="0" w:type="dxa"/>
-          </w:tblCellMar>
-        </w:tblPrEx>
         <w:tc>
           <w:tcPr>
             <w:tcW w:w="2500" w:type="dxa"/>
@@ -7415,12 +9305,6 @@
         </w:tc>
       </w:tr>
       <w:tr>
-        <w:tblPrEx>
-          <w:tblCellMar>
-            <w:top w:w="0" w:type="dxa"/>
-            <w:bottom w:w="0" w:type="dxa"/>
-          </w:tblCellMar>
-        </w:tblPrEx>
         <w:tc>
           <w:tcPr>
             <w:tcW w:w="2500" w:type="dxa"/>
@@ -7463,12 +9347,6 @@
         </w:tc>
       </w:tr>
       <w:tr>
-        <w:tblPrEx>
-          <w:tblCellMar>
-            <w:top w:w="0" w:type="dxa"/>
-            <w:bottom w:w="0" w:type="dxa"/>
-          </w:tblCellMar>
-        </w:tblPrEx>
         <w:tc>
           <w:tcPr>
             <w:tcW w:w="2500" w:type="dxa"/>
@@ -7535,6 +9413,7 @@
         <w:pStyle w:val="Ttulo2"/>
         <w:spacing w:before="220" w:after="100"/>
       </w:pPr>
+      <w:bookmarkStart w:id="30" w:name="_Toc235227447"/>
       <w:r>
         <w:rPr>
           <w:b/>
@@ -7545,6 +9424,7 @@
         </w:rPr>
         <w:t>Anexo B. Inventario de pantallas del MVP</w:t>
       </w:r>
+      <w:bookmarkEnd w:id="30"/>
     </w:p>
     <w:tbl>
       <w:tblPr>
@@ -7568,12 +9448,6 @@
         <w:gridCol w:w="6860"/>
       </w:tblGrid>
       <w:tr>
-        <w:tblPrEx>
-          <w:tblCellMar>
-            <w:top w:w="0" w:type="dxa"/>
-            <w:bottom w:w="0" w:type="dxa"/>
-          </w:tblCellMar>
-        </w:tblPrEx>
         <w:trPr>
           <w:tblHeader/>
         </w:trPr>
@@ -7627,12 +9501,6 @@
         </w:tc>
       </w:tr>
       <w:tr>
-        <w:tblPrEx>
-          <w:tblCellMar>
-            <w:top w:w="0" w:type="dxa"/>
-            <w:bottom w:w="0" w:type="dxa"/>
-          </w:tblCellMar>
-        </w:tblPrEx>
         <w:tc>
           <w:tcPr>
             <w:tcW w:w="2500" w:type="dxa"/>
@@ -7675,12 +9543,6 @@
         </w:tc>
       </w:tr>
       <w:tr>
-        <w:tblPrEx>
-          <w:tblCellMar>
-            <w:top w:w="0" w:type="dxa"/>
-            <w:bottom w:w="0" w:type="dxa"/>
-          </w:tblCellMar>
-        </w:tblPrEx>
         <w:tc>
           <w:tcPr>
             <w:tcW w:w="2500" w:type="dxa"/>
@@ -7734,12 +9596,6 @@
         </w:tc>
       </w:tr>
       <w:tr>
-        <w:tblPrEx>
-          <w:tblCellMar>
-            <w:top w:w="0" w:type="dxa"/>
-            <w:bottom w:w="0" w:type="dxa"/>
-          </w:tblCellMar>
-        </w:tblPrEx>
         <w:tc>
           <w:tcPr>
             <w:tcW w:w="2500" w:type="dxa"/>
@@ -7823,26 +9679,9 @@
       <w:pPr>
         <w:spacing w:after="160" w:line="276" w:lineRule="auto"/>
       </w:pPr>
-      <w:r>
-        <w:rPr>
-          <w:b/>
-          <w:bCs/>
-        </w:rPr>
-        <w:t xml:space="preserve">Fin del informe. </w:t>
-      </w:r>
-      <w:r>
-        <w:rPr>
-          <w:i/>
-          <w:iCs/>
-          <w:color w:val="5F5E5A"/>
-          <w:sz w:val="20"/>
-          <w:szCs w:val="20"/>
-        </w:rPr>
-        <w:t>Documento generado como entregable del subproyecto «Alan &amp; Aura Académico» para su revisión académica.</w:t>
-      </w:r>
     </w:p>
     <w:sectPr>
-      <w:footerReference w:type="default" r:id="rId7"/>
+      <w:footerReference w:type="default" r:id="rId8"/>
       <w:pgSz w:w="12240" w:h="15840"/>
       <w:pgMar w:top="1440" w:right="1440" w:bottom="1440" w:left="1440" w:header="708" w:footer="708" w:gutter="0"/>
       <w:cols w:space="720"/>
@@ -8704,6 +10543,50 @@
       <w:szCs w:val="20"/>
     </w:rPr>
   </w:style>
+  <w:style w:type="paragraph" w:styleId="TtuloTDC">
+    <w:name w:val="TOC Heading"/>
+    <w:basedOn w:val="Ttulo1"/>
+    <w:next w:val="Normal"/>
+    <w:uiPriority w:val="39"/>
+    <w:unhideWhenUsed/>
+    <w:qFormat/>
+    <w:rsid w:val="004C4DAA"/>
+    <w:pPr>
+      <w:keepNext/>
+      <w:keepLines/>
+      <w:spacing w:before="240" w:line="259" w:lineRule="auto"/>
+      <w:outlineLvl w:val="9"/>
+    </w:pPr>
+    <w:rPr>
+      <w:rFonts w:asciiTheme="majorHAnsi" w:eastAsiaTheme="majorEastAsia" w:hAnsiTheme="majorHAnsi" w:cstheme="majorBidi"/>
+      <w:color w:val="0F4761" w:themeColor="accent1" w:themeShade="BF"/>
+    </w:rPr>
+  </w:style>
+  <w:style w:type="paragraph" w:styleId="TDC1">
+    <w:name w:val="toc 1"/>
+    <w:basedOn w:val="Normal"/>
+    <w:next w:val="Normal"/>
+    <w:autoRedefine/>
+    <w:uiPriority w:val="39"/>
+    <w:unhideWhenUsed/>
+    <w:rsid w:val="004C4DAA"/>
+    <w:pPr>
+      <w:spacing w:after="100"/>
+    </w:pPr>
+  </w:style>
+  <w:style w:type="paragraph" w:styleId="TDC2">
+    <w:name w:val="toc 2"/>
+    <w:basedOn w:val="Normal"/>
+    <w:next w:val="Normal"/>
+    <w:autoRedefine/>
+    <w:uiPriority w:val="39"/>
+    <w:unhideWhenUsed/>
+    <w:rsid w:val="004C4DAA"/>
+    <w:pPr>
+      <w:spacing w:after="100"/>
+      <w:ind w:left="220"/>
+    </w:pPr>
+  </w:style>
 </w:styles>
 </file>
 
@@ -9020,4 +10903,16 @@
     </a:ext>
   </a:extLst>
 </a:theme>
+</file>
+
+<file path=customXml/item1.xml><?xml version="1.0" encoding="utf-8"?>
+<b:Sources xmlns:b="http://schemas.openxmlformats.org/officeDocument/2006/bibliography" xmlns="http://schemas.openxmlformats.org/officeDocument/2006/bibliography" SelectedStyle="\APASixthEditionOfficeOnline.xsl" StyleName="APA" Version="6"/>
+</file>
+
+<file path=customXml/itemProps1.xml><?xml version="1.0" encoding="utf-8"?>
+<ds:datastoreItem xmlns:ds="http://schemas.openxmlformats.org/officeDocument/2006/customXml" ds:itemID="{F8AB658B-B6C6-4C2B-8872-25CC1B57799E}">
+  <ds:schemaRefs>
+    <ds:schemaRef ds:uri="http://schemas.openxmlformats.org/officeDocument/2006/bibliography"/>
+  </ds:schemaRefs>
+</ds:datastoreItem>
 </file>
</xml_diff>